<commit_message>
try solving too long validaiton time: transfer to use torch dataset and dataloader
</commit_message>
<xml_diff>
--- a/作业记录.docx
+++ b/作业记录.docx
@@ -145,7 +145,21 @@
         <w:rPr>
           <w:rFonts w:hint="eastAsia"/>
         </w:rPr>
-        <w:t>，计算了不同模块的FLOPs占比，以及占比随model size的变化</w:t>
+        <w:t>，计算了不同模块的FLOPs占比，以及</w:t>
+      </w:r>
+      <w:proofErr w:type="gramStart"/>
+      <w:r>
+        <w:rPr>
+          <w:rFonts w:hint="eastAsia"/>
+        </w:rPr>
+        <w:t>占比随</w:t>
+      </w:r>
+      <w:proofErr w:type="gramEnd"/>
+      <w:r>
+        <w:rPr>
+          <w:rFonts w:hint="eastAsia"/>
+        </w:rPr>
+        <w:t>model size的变化</w:t>
       </w:r>
     </w:p>
     <w:p>
@@ -522,8 +536,17 @@
           <w:rFonts w:hint="eastAsia"/>
           <w:u w:val="single"/>
         </w:rPr>
-        <w:t>工具：wandb</w:t>
-      </w:r>
+        <w:t>工具：</w:t>
+      </w:r>
+      <w:proofErr w:type="spellStart"/>
+      <w:r>
+        <w:rPr>
+          <w:rFonts w:hint="eastAsia"/>
+          <w:u w:val="single"/>
+        </w:rPr>
+        <w:t>wandb</w:t>
+      </w:r>
+      <w:proofErr w:type="spellEnd"/>
     </w:p>
     <w:p>
       <w:pPr>
@@ -635,11 +658,19 @@
           <w:rFonts w:hint="eastAsia"/>
         </w:rPr>
       </w:pPr>
-      <w:r>
-        <w:rPr>
-          <w:rFonts w:hint="eastAsia"/>
-        </w:rPr>
-        <w:t>Softmax with temperature scaling</w:t>
+      <w:proofErr w:type="spellStart"/>
+      <w:r>
+        <w:rPr>
+          <w:rFonts w:hint="eastAsia"/>
+        </w:rPr>
+        <w:t>Softmax</w:t>
+      </w:r>
+      <w:proofErr w:type="spellEnd"/>
+      <w:r>
+        <w:rPr>
+          <w:rFonts w:hint="eastAsia"/>
+        </w:rPr>
+        <w:t xml:space="preserve"> with temperature scaling</w:t>
       </w:r>
     </w:p>
     <w:p>
@@ -671,37 +702,6 @@
       <w:pPr>
         <w:rPr>
           <w:rFonts w:hint="eastAsia"/>
-          <w:b/>
-          <w:bCs/>
-        </w:rPr>
-      </w:pPr>
-      <w:r>
-        <w:rPr>
-          <w:rFonts w:hint="eastAsia"/>
-          <w:b/>
-          <w:bCs/>
-        </w:rPr>
-        <w:t>T</w:t>
-      </w:r>
-      <w:r>
-        <w:rPr>
-          <w:b/>
-          <w:bCs/>
-        </w:rPr>
-        <w:t>odo:</w:t>
-      </w:r>
-    </w:p>
-    <w:p>
-      <w:pPr>
-        <w:rPr>
-          <w:rFonts w:hint="eastAsia"/>
-        </w:rPr>
-      </w:pPr>
-    </w:p>
-    <w:p>
-      <w:pPr>
-        <w:rPr>
-          <w:rFonts w:hint="eastAsia"/>
         </w:rPr>
       </w:pPr>
       <w:r>
@@ -795,6 +795,7 @@
         <w:pStyle w:val="a9"/>
         <w:ind w:left="360"/>
         <w:rPr>
+          <w:rFonts w:hint="eastAsia"/>
           <w:lang w:val="fr-FR"/>
         </w:rPr>
       </w:pPr>
@@ -842,6 +843,7 @@
           <w:numId w:val="6"/>
         </w:numPr>
         <w:rPr>
+          <w:rFonts w:hint="eastAsia"/>
           <w:lang w:val="fr-FR"/>
         </w:rPr>
       </w:pPr>
@@ -873,20 +875,23 @@
     <w:p>
       <w:pPr>
         <w:rPr>
-          <w:lang w:val="fr-FR"/>
-        </w:rPr>
-      </w:pPr>
-    </w:p>
-    <w:p>
-      <w:pPr>
-        <w:rPr>
-          <w:lang w:val="fr-FR"/>
-        </w:rPr>
-      </w:pPr>
-    </w:p>
-    <w:p>
-      <w:pPr>
-        <w:rPr>
+          <w:rFonts w:hint="eastAsia"/>
+          <w:lang w:val="fr-FR"/>
+        </w:rPr>
+      </w:pPr>
+    </w:p>
+    <w:p>
+      <w:pPr>
+        <w:rPr>
+          <w:rFonts w:hint="eastAsia"/>
+          <w:lang w:val="fr-FR"/>
+        </w:rPr>
+      </w:pPr>
+    </w:p>
+    <w:p>
+      <w:pPr>
+        <w:rPr>
+          <w:rFonts w:hint="eastAsia"/>
           <w:lang w:val="fr-FR"/>
         </w:rPr>
       </w:pPr>
@@ -906,14 +911,16 @@
           <w:numId w:val="9"/>
         </w:numPr>
         <w:rPr>
-          <w:lang w:val="fr-FR"/>
-        </w:rPr>
-      </w:pPr>
-      <w:r>
-        <w:rPr>
-          <w:rFonts w:hint="eastAsia"/>
-          <w:lang w:val="fr-FR"/>
-        </w:rPr>
+          <w:rFonts w:hint="eastAsia"/>
+          <w:lang w:val="fr-FR"/>
+        </w:rPr>
+      </w:pPr>
+      <w:r>
+        <w:rPr>
+          <w:rFonts w:hint="eastAsia"/>
+          <w:lang w:val="fr-FR"/>
+        </w:rPr>
+        <w:lastRenderedPageBreak/>
         <w:t>设置device：</w:t>
       </w:r>
     </w:p>
@@ -939,6 +946,7 @@
         <w:pStyle w:val="a9"/>
         <w:ind w:left="360"/>
         <w:rPr>
+          <w:rFonts w:hint="eastAsia"/>
           <w:lang w:val="fr-FR"/>
         </w:rPr>
       </w:pPr>
@@ -968,27 +976,16 @@
       <w:pPr>
         <w:pStyle w:val="a9"/>
         <w:ind w:left="360"/>
-      </w:pPr>
-      <w:r>
-        <w:rPr>
-          <w:rFonts w:hint="eastAsia"/>
-          <w:lang w:val="fr-FR"/>
-        </w:rPr>
-        <w:t>可影响tensor：</w:t>
-      </w:r>
-      <w:r>
-        <w:rPr>
-          <w:rFonts w:hint="eastAsia"/>
-          <w:lang w:val="fr-FR"/>
-        </w:rPr>
-        <w:t>parameters()/ buffers()</w:t>
-      </w:r>
-      <w:r>
-        <w:rPr>
-          <w:rFonts w:hint="eastAsia"/>
-          <w:lang w:val="fr-FR"/>
-        </w:rPr>
-        <w:t>。所以</w:t>
+        <w:rPr>
+          <w:rFonts w:hint="eastAsia"/>
+        </w:rPr>
+      </w:pPr>
+      <w:r>
+        <w:rPr>
+          <w:rFonts w:hint="eastAsia"/>
+          <w:lang w:val="fr-FR"/>
+        </w:rPr>
+        <w:t>可影响tensor：parameters()/ buffers()。所以</w:t>
       </w:r>
       <w:r>
         <w:rPr>
@@ -1051,16 +1048,216 @@
     <w:p>
       <w:pPr>
         <w:rPr>
-          <w:rFonts w:hint="eastAsia"/>
-          <w:lang w:val="fr-FR"/>
-        </w:rPr>
-      </w:pPr>
+          <w:lang w:val="fr-FR"/>
+        </w:rPr>
+      </w:pPr>
+      <w:r>
+        <w:rPr>
+          <w:rFonts w:hint="eastAsia"/>
+          <w:lang w:val="fr-FR"/>
+        </w:rPr>
+        <w:t>参数：</w:t>
+      </w:r>
+    </w:p>
+    <w:p>
+      <w:pPr>
+        <w:pStyle w:val="a9"/>
+        <w:numPr>
+          <w:ilvl w:val="0"/>
+          <w:numId w:val="11"/>
+        </w:numPr>
+        <w:rPr>
+          <w:rFonts w:hint="eastAsia"/>
+        </w:rPr>
+      </w:pPr>
+      <w:proofErr w:type="spellStart"/>
+      <w:r>
+        <w:rPr>
+          <w:rFonts w:hint="eastAsia"/>
+        </w:rPr>
+        <w:t>Dataloader</w:t>
+      </w:r>
+      <w:proofErr w:type="spellEnd"/>
+      <w:r>
+        <w:rPr>
+          <w:rFonts w:hint="eastAsia"/>
+        </w:rPr>
+        <w:t>：</w:t>
+      </w:r>
+      <w:proofErr w:type="spellStart"/>
+      <w:r>
+        <w:rPr>
+          <w:rFonts w:hint="eastAsia"/>
+        </w:rPr>
+        <w:t>drop_last</w:t>
+      </w:r>
+      <w:proofErr w:type="spellEnd"/>
+      <w:r>
+        <w:rPr>
+          <w:rFonts w:hint="eastAsia"/>
+        </w:rPr>
+        <w:t xml:space="preserve"> = Tr</w:t>
+      </w:r>
+      <w:r>
+        <w:rPr>
+          <w:rFonts w:hint="eastAsia"/>
+        </w:rPr>
+        <w:t>ue</w:t>
+      </w:r>
+    </w:p>
+    <w:p>
+      <w:pPr>
+        <w:rPr>
+          <w:rFonts w:hint="eastAsia"/>
+        </w:rPr>
+      </w:pPr>
+    </w:p>
+    <w:p>
+      <w:pPr>
+        <w:rPr>
+          <w:rFonts w:hint="eastAsia"/>
+          <w:lang w:val="fr-FR"/>
+        </w:rPr>
+      </w:pPr>
+      <w:r>
+        <w:rPr>
+          <w:rFonts w:hint="eastAsia"/>
+          <w:lang w:val="fr-FR"/>
+        </w:rPr>
+        <w:t>问题：</w:t>
+      </w:r>
+    </w:p>
+    <w:p>
+      <w:pPr>
+        <w:pStyle w:val="a9"/>
+        <w:numPr>
+          <w:ilvl w:val="0"/>
+          <w:numId w:val="10"/>
+        </w:numPr>
+        <w:rPr>
+          <w:rFonts w:hint="eastAsia"/>
+          <w:lang w:val="fr-FR"/>
+        </w:rPr>
+      </w:pPr>
+      <w:r>
+        <w:rPr>
+          <w:rFonts w:hint="eastAsia"/>
+          <w:lang w:val="fr-FR"/>
+        </w:rPr>
+        <w:t>Validation时间过长</w:t>
+      </w:r>
     </w:p>
     <w:p>
       <w:pPr>
         <w:pStyle w:val="a9"/>
         <w:ind w:left="360"/>
         <w:rPr>
+          <w:rFonts w:hint="eastAsia"/>
+          <w:lang w:val="fr-FR"/>
+        </w:rPr>
+      </w:pPr>
+      <w:r>
+        <w:rPr>
+          <w:rFonts w:hint="eastAsia"/>
+          <w:lang w:val="fr-FR"/>
+        </w:rPr>
+        <w:t>Validation时长：49min，estimate validation时长：0.57min</w:t>
+      </w:r>
+    </w:p>
+    <w:p>
+      <w:pPr>
+        <w:pStyle w:val="a9"/>
+        <w:ind w:left="360"/>
+        <w:rPr>
+          <w:rFonts w:hint="eastAsia"/>
+          <w:lang w:val="fr-FR"/>
+        </w:rPr>
+      </w:pPr>
+      <w:r>
+        <w:rPr>
+          <w:rFonts w:hint="eastAsia"/>
+          <w:lang w:val="fr-FR"/>
+        </w:rPr>
+        <w:t>考虑问题：CustomDataLoader效率太低</w:t>
+      </w:r>
+    </w:p>
+    <w:p>
+      <w:pPr>
+        <w:pStyle w:val="a9"/>
+        <w:ind w:left="360"/>
+        <w:rPr>
+          <w:rFonts w:hint="eastAsia"/>
+          <w:lang w:val="fr-FR"/>
+        </w:rPr>
+      </w:pPr>
+      <w:r>
+        <w:rPr>
+          <w:rFonts w:hint="eastAsia"/>
+          <w:lang w:val="fr-FR"/>
+        </w:rPr>
+        <w:t>测试：改为使用torch的dataloader，</w:t>
+      </w:r>
+      <w:proofErr w:type="gramStart"/>
+      <w:r>
+        <w:rPr>
+          <w:rFonts w:hint="eastAsia"/>
+          <w:lang w:val="fr-FR"/>
+        </w:rPr>
+        <w:t>再只在</w:t>
+      </w:r>
+      <w:proofErr w:type="gramEnd"/>
+      <w:r>
+        <w:rPr>
+          <w:rFonts w:hint="eastAsia"/>
+          <w:lang w:val="fr-FR"/>
+        </w:rPr>
+        <w:t>validation set上跑一遍看时长</w:t>
+      </w:r>
+    </w:p>
+    <w:p>
+      <w:pPr>
+        <w:rPr>
+          <w:rFonts w:hint="eastAsia"/>
+          <w:lang w:val="fr-FR"/>
+        </w:rPr>
+      </w:pPr>
+    </w:p>
+    <w:p>
+      <w:pPr>
+        <w:rPr>
+          <w:rFonts w:hint="eastAsia"/>
+          <w:lang w:val="fr-FR"/>
+        </w:rPr>
+      </w:pPr>
+    </w:p>
+    <w:p>
+      <w:pPr>
+        <w:rPr>
+          <w:rFonts w:hint="eastAsia"/>
+          <w:lang w:val="fr-FR"/>
+        </w:rPr>
+      </w:pPr>
+    </w:p>
+    <w:p>
+      <w:pPr>
+        <w:rPr>
+          <w:rFonts w:hint="eastAsia"/>
+        </w:rPr>
+      </w:pPr>
+      <w:r>
+        <w:rPr>
+          <w:rFonts w:hint="eastAsia"/>
+        </w:rPr>
+        <w:t>T</w:t>
+      </w:r>
+      <w:r>
+        <w:t>odo:</w:t>
+      </w:r>
+    </w:p>
+    <w:p>
+      <w:pPr>
+        <w:rPr>
+          <w:rFonts w:hint="eastAsia"/>
           <w:lang w:val="fr-FR"/>
         </w:rPr>
       </w:pPr>
@@ -1314,6 +1511,95 @@
     </w:lvl>
   </w:abstractNum>
   <w:abstractNum w:abstractNumId="2" w15:restartNumberingAfterBreak="0">
+    <w:nsid w:val="1A05721D"/>
+    <w:multiLevelType w:val="hybridMultilevel"/>
+    <w:tmpl w:val="CEF8A43A"/>
+    <w:lvl w:ilvl="0" w:tplc="FE78F5D0">
+      <w:start w:val="1"/>
+      <w:numFmt w:val="decimal"/>
+      <w:lvlText w:val="%1."/>
+      <w:lvlJc w:val="left"/>
+      <w:pPr>
+        <w:ind w:left="360" w:hanging="360"/>
+      </w:pPr>
+      <w:rPr>
+        <w:rFonts w:hint="default"/>
+      </w:rPr>
+    </w:lvl>
+    <w:lvl w:ilvl="1" w:tplc="04090019" w:tentative="1">
+      <w:start w:val="1"/>
+      <w:numFmt w:val="lowerLetter"/>
+      <w:lvlText w:val="%2)"/>
+      <w:lvlJc w:val="left"/>
+      <w:pPr>
+        <w:ind w:left="880" w:hanging="440"/>
+      </w:pPr>
+    </w:lvl>
+    <w:lvl w:ilvl="2" w:tplc="0409001B" w:tentative="1">
+      <w:start w:val="1"/>
+      <w:numFmt w:val="lowerRoman"/>
+      <w:lvlText w:val="%3."/>
+      <w:lvlJc w:val="right"/>
+      <w:pPr>
+        <w:ind w:left="1320" w:hanging="440"/>
+      </w:pPr>
+    </w:lvl>
+    <w:lvl w:ilvl="3" w:tplc="0409000F" w:tentative="1">
+      <w:start w:val="1"/>
+      <w:numFmt w:val="decimal"/>
+      <w:lvlText w:val="%4."/>
+      <w:lvlJc w:val="left"/>
+      <w:pPr>
+        <w:ind w:left="1760" w:hanging="440"/>
+      </w:pPr>
+    </w:lvl>
+    <w:lvl w:ilvl="4" w:tplc="04090019" w:tentative="1">
+      <w:start w:val="1"/>
+      <w:numFmt w:val="lowerLetter"/>
+      <w:lvlText w:val="%5)"/>
+      <w:lvlJc w:val="left"/>
+      <w:pPr>
+        <w:ind w:left="2200" w:hanging="440"/>
+      </w:pPr>
+    </w:lvl>
+    <w:lvl w:ilvl="5" w:tplc="0409001B" w:tentative="1">
+      <w:start w:val="1"/>
+      <w:numFmt w:val="lowerRoman"/>
+      <w:lvlText w:val="%6."/>
+      <w:lvlJc w:val="right"/>
+      <w:pPr>
+        <w:ind w:left="2640" w:hanging="440"/>
+      </w:pPr>
+    </w:lvl>
+    <w:lvl w:ilvl="6" w:tplc="0409000F" w:tentative="1">
+      <w:start w:val="1"/>
+      <w:numFmt w:val="decimal"/>
+      <w:lvlText w:val="%7."/>
+      <w:lvlJc w:val="left"/>
+      <w:pPr>
+        <w:ind w:left="3080" w:hanging="440"/>
+      </w:pPr>
+    </w:lvl>
+    <w:lvl w:ilvl="7" w:tplc="04090019" w:tentative="1">
+      <w:start w:val="1"/>
+      <w:numFmt w:val="lowerLetter"/>
+      <w:lvlText w:val="%8)"/>
+      <w:lvlJc w:val="left"/>
+      <w:pPr>
+        <w:ind w:left="3520" w:hanging="440"/>
+      </w:pPr>
+    </w:lvl>
+    <w:lvl w:ilvl="8" w:tplc="0409001B" w:tentative="1">
+      <w:start w:val="1"/>
+      <w:numFmt w:val="lowerRoman"/>
+      <w:lvlText w:val="%9."/>
+      <w:lvlJc w:val="right"/>
+      <w:pPr>
+        <w:ind w:left="3960" w:hanging="440"/>
+      </w:pPr>
+    </w:lvl>
+  </w:abstractNum>
+  <w:abstractNum w:abstractNumId="3" w15:restartNumberingAfterBreak="0">
     <w:nsid w:val="298D3115"/>
     <w:multiLevelType w:val="hybridMultilevel"/>
     <w:tmpl w:val="65AE4E2E"/>
@@ -1402,7 +1688,96 @@
       </w:pPr>
     </w:lvl>
   </w:abstractNum>
-  <w:abstractNum w:abstractNumId="3" w15:restartNumberingAfterBreak="0">
+  <w:abstractNum w:abstractNumId="4" w15:restartNumberingAfterBreak="0">
+    <w:nsid w:val="33C552A7"/>
+    <w:multiLevelType w:val="hybridMultilevel"/>
+    <w:tmpl w:val="606A3086"/>
+    <w:lvl w:ilvl="0" w:tplc="D6169A98">
+      <w:start w:val="1"/>
+      <w:numFmt w:val="decimal"/>
+      <w:lvlText w:val="%1."/>
+      <w:lvlJc w:val="left"/>
+      <w:pPr>
+        <w:ind w:left="360" w:hanging="360"/>
+      </w:pPr>
+      <w:rPr>
+        <w:rFonts w:hint="default"/>
+      </w:rPr>
+    </w:lvl>
+    <w:lvl w:ilvl="1" w:tplc="04090019" w:tentative="1">
+      <w:start w:val="1"/>
+      <w:numFmt w:val="lowerLetter"/>
+      <w:lvlText w:val="%2)"/>
+      <w:lvlJc w:val="left"/>
+      <w:pPr>
+        <w:ind w:left="880" w:hanging="440"/>
+      </w:pPr>
+    </w:lvl>
+    <w:lvl w:ilvl="2" w:tplc="0409001B" w:tentative="1">
+      <w:start w:val="1"/>
+      <w:numFmt w:val="lowerRoman"/>
+      <w:lvlText w:val="%3."/>
+      <w:lvlJc w:val="right"/>
+      <w:pPr>
+        <w:ind w:left="1320" w:hanging="440"/>
+      </w:pPr>
+    </w:lvl>
+    <w:lvl w:ilvl="3" w:tplc="0409000F" w:tentative="1">
+      <w:start w:val="1"/>
+      <w:numFmt w:val="decimal"/>
+      <w:lvlText w:val="%4."/>
+      <w:lvlJc w:val="left"/>
+      <w:pPr>
+        <w:ind w:left="1760" w:hanging="440"/>
+      </w:pPr>
+    </w:lvl>
+    <w:lvl w:ilvl="4" w:tplc="04090019" w:tentative="1">
+      <w:start w:val="1"/>
+      <w:numFmt w:val="lowerLetter"/>
+      <w:lvlText w:val="%5)"/>
+      <w:lvlJc w:val="left"/>
+      <w:pPr>
+        <w:ind w:left="2200" w:hanging="440"/>
+      </w:pPr>
+    </w:lvl>
+    <w:lvl w:ilvl="5" w:tplc="0409001B" w:tentative="1">
+      <w:start w:val="1"/>
+      <w:numFmt w:val="lowerRoman"/>
+      <w:lvlText w:val="%6."/>
+      <w:lvlJc w:val="right"/>
+      <w:pPr>
+        <w:ind w:left="2640" w:hanging="440"/>
+      </w:pPr>
+    </w:lvl>
+    <w:lvl w:ilvl="6" w:tplc="0409000F" w:tentative="1">
+      <w:start w:val="1"/>
+      <w:numFmt w:val="decimal"/>
+      <w:lvlText w:val="%7."/>
+      <w:lvlJc w:val="left"/>
+      <w:pPr>
+        <w:ind w:left="3080" w:hanging="440"/>
+      </w:pPr>
+    </w:lvl>
+    <w:lvl w:ilvl="7" w:tplc="04090019" w:tentative="1">
+      <w:start w:val="1"/>
+      <w:numFmt w:val="lowerLetter"/>
+      <w:lvlText w:val="%8)"/>
+      <w:lvlJc w:val="left"/>
+      <w:pPr>
+        <w:ind w:left="3520" w:hanging="440"/>
+      </w:pPr>
+    </w:lvl>
+    <w:lvl w:ilvl="8" w:tplc="0409001B" w:tentative="1">
+      <w:start w:val="1"/>
+      <w:numFmt w:val="lowerRoman"/>
+      <w:lvlText w:val="%9."/>
+      <w:lvlJc w:val="right"/>
+      <w:pPr>
+        <w:ind w:left="3960" w:hanging="440"/>
+      </w:pPr>
+    </w:lvl>
+  </w:abstractNum>
+  <w:abstractNum w:abstractNumId="5" w15:restartNumberingAfterBreak="0">
     <w:nsid w:val="35EE3911"/>
     <w:multiLevelType w:val="hybridMultilevel"/>
     <w:tmpl w:val="E8DCDB16"/>
@@ -1515,7 +1890,7 @@
       </w:rPr>
     </w:lvl>
   </w:abstractNum>
-  <w:abstractNum w:abstractNumId="4" w15:restartNumberingAfterBreak="0">
+  <w:abstractNum w:abstractNumId="6" w15:restartNumberingAfterBreak="0">
     <w:nsid w:val="4405269E"/>
     <w:multiLevelType w:val="hybridMultilevel"/>
     <w:tmpl w:val="072CA276"/>
@@ -1628,7 +2003,7 @@
       </w:rPr>
     </w:lvl>
   </w:abstractNum>
-  <w:abstractNum w:abstractNumId="5" w15:restartNumberingAfterBreak="0">
+  <w:abstractNum w:abstractNumId="7" w15:restartNumberingAfterBreak="0">
     <w:nsid w:val="47AA1B63"/>
     <w:multiLevelType w:val="hybridMultilevel"/>
     <w:tmpl w:val="505664DA"/>
@@ -1717,7 +2092,7 @@
       </w:pPr>
     </w:lvl>
   </w:abstractNum>
-  <w:abstractNum w:abstractNumId="6" w15:restartNumberingAfterBreak="0">
+  <w:abstractNum w:abstractNumId="8" w15:restartNumberingAfterBreak="0">
     <w:nsid w:val="5B9B1623"/>
     <w:multiLevelType w:val="hybridMultilevel"/>
     <w:tmpl w:val="E76CACAE"/>
@@ -1806,7 +2181,7 @@
       </w:pPr>
     </w:lvl>
   </w:abstractNum>
-  <w:abstractNum w:abstractNumId="7" w15:restartNumberingAfterBreak="0">
+  <w:abstractNum w:abstractNumId="9" w15:restartNumberingAfterBreak="0">
     <w:nsid w:val="62B172BF"/>
     <w:multiLevelType w:val="hybridMultilevel"/>
     <w:tmpl w:val="1D66575A"/>
@@ -1919,7 +2294,7 @@
       </w:rPr>
     </w:lvl>
   </w:abstractNum>
-  <w:abstractNum w:abstractNumId="8" w15:restartNumberingAfterBreak="0">
+  <w:abstractNum w:abstractNumId="10" w15:restartNumberingAfterBreak="0">
     <w:nsid w:val="643F0A79"/>
     <w:multiLevelType w:val="hybridMultilevel"/>
     <w:tmpl w:val="07BE7228"/>
@@ -2012,27 +2387,33 @@
     <w:abstractNumId w:val="0"/>
   </w:num>
   <w:num w:numId="2" w16cid:durableId="1578438118">
-    <w:abstractNumId w:val="8"/>
+    <w:abstractNumId w:val="10"/>
   </w:num>
   <w:num w:numId="3" w16cid:durableId="867763447">
-    <w:abstractNumId w:val="4"/>
+    <w:abstractNumId w:val="6"/>
   </w:num>
   <w:num w:numId="4" w16cid:durableId="864565369">
-    <w:abstractNumId w:val="5"/>
+    <w:abstractNumId w:val="7"/>
   </w:num>
   <w:num w:numId="5" w16cid:durableId="350112403">
-    <w:abstractNumId w:val="6"/>
+    <w:abstractNumId w:val="8"/>
   </w:num>
   <w:num w:numId="6" w16cid:durableId="1786385003">
     <w:abstractNumId w:val="1"/>
   </w:num>
   <w:num w:numId="7" w16cid:durableId="1036200526">
-    <w:abstractNumId w:val="7"/>
+    <w:abstractNumId w:val="9"/>
   </w:num>
   <w:num w:numId="8" w16cid:durableId="1890530902">
+    <w:abstractNumId w:val="5"/>
+  </w:num>
+  <w:num w:numId="9" w16cid:durableId="1180897774">
     <w:abstractNumId w:val="3"/>
   </w:num>
-  <w:num w:numId="9" w16cid:durableId="1180897774">
+  <w:num w:numId="10" w16cid:durableId="1018233281">
+    <w:abstractNumId w:val="4"/>
+  </w:num>
+  <w:num w:numId="11" w16cid:durableId="787048811">
     <w:abstractNumId w:val="2"/>
   </w:num>
 </w:numbering>

</xml_diff>

<commit_message>
add validation and checkpointing log
</commit_message>
<xml_diff>
--- a/作业记录.docx
+++ b/作业记录.docx
@@ -37,33 +37,17 @@
         </w:rPr>
         <w:t xml:space="preserve">手写了transformer LM：Linear, Embedding, MHA, </w:t>
       </w:r>
-      <w:proofErr w:type="spellStart"/>
-      <w:r>
-        <w:rPr>
-          <w:rFonts w:hint="eastAsia"/>
-        </w:rPr>
-        <w:t>RoPE</w:t>
-      </w:r>
-      <w:proofErr w:type="spellEnd"/>
-      <w:r>
-        <w:rPr>
-          <w:rFonts w:hint="eastAsia"/>
-        </w:rPr>
-        <w:t xml:space="preserve">, </w:t>
-      </w:r>
-      <w:proofErr w:type="spellStart"/>
-      <w:r>
-        <w:rPr>
-          <w:rFonts w:hint="eastAsia"/>
-        </w:rPr>
-        <w:t>SwiGLU</w:t>
-      </w:r>
-      <w:proofErr w:type="spellEnd"/>
-      <w:r>
-        <w:rPr>
-          <w:rFonts w:hint="eastAsia"/>
-        </w:rPr>
-        <w:t>, etc.</w:t>
+      <w:r>
+        <w:rPr>
+          <w:rFonts w:hint="eastAsia"/>
+        </w:rPr>
+        <w:t xml:space="preserve">RoPE, </w:t>
+      </w:r>
+      <w:r>
+        <w:rPr>
+          <w:rFonts w:hint="eastAsia"/>
+        </w:rPr>
+        <w:t>SwiGLU, etc.</w:t>
       </w:r>
     </w:p>
     <w:p>
@@ -145,21 +129,7 @@
         <w:rPr>
           <w:rFonts w:hint="eastAsia"/>
         </w:rPr>
-        <w:t>，计算了不同模块的FLOPs占比，以及</w:t>
-      </w:r>
-      <w:proofErr w:type="gramStart"/>
-      <w:r>
-        <w:rPr>
-          <w:rFonts w:hint="eastAsia"/>
-        </w:rPr>
-        <w:t>占比随</w:t>
-      </w:r>
-      <w:proofErr w:type="gramEnd"/>
-      <w:r>
-        <w:rPr>
-          <w:rFonts w:hint="eastAsia"/>
-        </w:rPr>
-        <w:t>model size的变化</w:t>
+        <w:t>，计算了不同模块的FLOPs占比，以及占比随model size的变化</w:t>
       </w:r>
     </w:p>
     <w:p>
@@ -177,21 +147,7 @@
         <w:rPr>
           <w:rFonts w:hint="eastAsia"/>
         </w:rPr>
-        <w:t>手写了</w:t>
-      </w:r>
-      <w:proofErr w:type="spellStart"/>
-      <w:r>
-        <w:rPr>
-          <w:rFonts w:hint="eastAsia"/>
-        </w:rPr>
-        <w:t>AdamW</w:t>
-      </w:r>
-      <w:proofErr w:type="spellEnd"/>
-      <w:r>
-        <w:rPr>
-          <w:rFonts w:hint="eastAsia"/>
-        </w:rPr>
-        <w:t xml:space="preserve"> optimizer</w:t>
+        <w:t>手写了AdamW optimizer</w:t>
       </w:r>
       <w:r>
         <w:rPr>
@@ -203,16 +159,8 @@
         <w:rPr>
           <w:rFonts w:hint="eastAsia"/>
         </w:rPr>
-        <w:t xml:space="preserve">估算了model训练时的peak </w:t>
-      </w:r>
-      <w:proofErr w:type="spellStart"/>
-      <w:r>
-        <w:rPr>
-          <w:rFonts w:hint="eastAsia"/>
-        </w:rPr>
-        <w:t>memeory</w:t>
-      </w:r>
-      <w:proofErr w:type="spellEnd"/>
+        <w:t>估算了model训练时的peak memeory</w:t>
+      </w:r>
       <w:r>
         <w:rPr>
           <w:rFonts w:hint="eastAsia"/>
@@ -336,23 +284,7 @@
           <w:rFonts w:hint="eastAsia"/>
           <w:color w:val="00B0F0"/>
         </w:rPr>
-        <w:t>Load data使用自定义stride，而不是</w:t>
-      </w:r>
-      <w:proofErr w:type="spellStart"/>
-      <w:r>
-        <w:rPr>
-          <w:rFonts w:hint="eastAsia"/>
-          <w:color w:val="00B0F0"/>
-        </w:rPr>
-        <w:t>context_length</w:t>
-      </w:r>
-      <w:proofErr w:type="spellEnd"/>
-      <w:r>
-        <w:rPr>
-          <w:rFonts w:hint="eastAsia"/>
-          <w:color w:val="00B0F0"/>
-        </w:rPr>
-        <w:t xml:space="preserve"> + 1</w:t>
+        <w:t>Load data使用自定义stride，而不是context_length + 1</w:t>
       </w:r>
     </w:p>
     <w:p>
@@ -507,19 +439,11 @@
         </w:rPr>
         <w:t xml:space="preserve">validation loss, </w:t>
       </w:r>
-      <w:proofErr w:type="spellStart"/>
-      <w:r>
-        <w:rPr>
-          <w:rFonts w:hint="eastAsia"/>
-        </w:rPr>
-        <w:t>lr</w:t>
-      </w:r>
-      <w:proofErr w:type="spellEnd"/>
-      <w:r>
-        <w:rPr>
-          <w:rFonts w:hint="eastAsia"/>
-        </w:rPr>
-        <w:t>, time</w:t>
+      <w:r>
+        <w:rPr>
+          <w:rFonts w:hint="eastAsia"/>
+        </w:rPr>
+        <w:t>lr, time</w:t>
       </w:r>
     </w:p>
     <w:p>
@@ -536,17 +460,8 @@
           <w:rFonts w:hint="eastAsia"/>
           <w:u w:val="single"/>
         </w:rPr>
-        <w:t>工具：</w:t>
-      </w:r>
-      <w:proofErr w:type="spellStart"/>
-      <w:r>
-        <w:rPr>
-          <w:rFonts w:hint="eastAsia"/>
-          <w:u w:val="single"/>
-        </w:rPr>
-        <w:t>wandb</w:t>
-      </w:r>
-      <w:proofErr w:type="spellEnd"/>
+        <w:t>工具：wandb</w:t>
+      </w:r>
     </w:p>
     <w:p>
       <w:pPr>
@@ -592,23 +507,7 @@
           <w:rFonts w:hint="eastAsia"/>
           <w:color w:val="00B0F0"/>
         </w:rPr>
-        <w:t>保存/恢复</w:t>
-      </w:r>
-      <w:proofErr w:type="spellStart"/>
-      <w:r>
-        <w:rPr>
-          <w:rFonts w:hint="eastAsia"/>
-          <w:color w:val="00B0F0"/>
-        </w:rPr>
-        <w:t>dataloader</w:t>
-      </w:r>
-      <w:proofErr w:type="spellEnd"/>
-      <w:r>
-        <w:rPr>
-          <w:rFonts w:hint="eastAsia"/>
-          <w:color w:val="00B0F0"/>
-        </w:rPr>
-        <w:t xml:space="preserve"> checkpoint</w:t>
+        <w:t>保存/恢复dataloader checkpoint</w:t>
       </w:r>
       <w:r>
         <w:rPr>
@@ -658,19 +557,11 @@
           <w:rFonts w:hint="eastAsia"/>
         </w:rPr>
       </w:pPr>
-      <w:proofErr w:type="spellStart"/>
-      <w:r>
-        <w:rPr>
-          <w:rFonts w:hint="eastAsia"/>
-        </w:rPr>
-        <w:t>Softmax</w:t>
-      </w:r>
-      <w:proofErr w:type="spellEnd"/>
-      <w:r>
-        <w:rPr>
-          <w:rFonts w:hint="eastAsia"/>
-        </w:rPr>
-        <w:t xml:space="preserve"> with temperature scaling</w:t>
+      <w:r>
+        <w:rPr>
+          <w:rFonts w:hint="eastAsia"/>
+        </w:rPr>
+        <w:t>Softmax with temperature scaling</w:t>
       </w:r>
     </w:p>
     <w:p>
@@ -1070,33 +961,11 @@
           <w:rFonts w:hint="eastAsia"/>
         </w:rPr>
       </w:pPr>
-      <w:proofErr w:type="spellStart"/>
-      <w:r>
-        <w:rPr>
-          <w:rFonts w:hint="eastAsia"/>
-        </w:rPr>
-        <w:t>Dataloader</w:t>
-      </w:r>
-      <w:proofErr w:type="spellEnd"/>
-      <w:r>
-        <w:rPr>
-          <w:rFonts w:hint="eastAsia"/>
-        </w:rPr>
-        <w:t>：</w:t>
-      </w:r>
-      <w:proofErr w:type="spellStart"/>
-      <w:r>
-        <w:rPr>
-          <w:rFonts w:hint="eastAsia"/>
-        </w:rPr>
-        <w:t>drop_last</w:t>
-      </w:r>
-      <w:proofErr w:type="spellEnd"/>
-      <w:r>
-        <w:rPr>
-          <w:rFonts w:hint="eastAsia"/>
-        </w:rPr>
-        <w:t xml:space="preserve"> = Tr</w:t>
+      <w:r>
+        <w:rPr>
+          <w:rFonts w:hint="eastAsia"/>
+        </w:rPr>
+        <w:t>Dataloader：drop_last = Tr</w:t>
       </w:r>
       <w:r>
         <w:rPr>
@@ -1195,55 +1064,34 @@
           <w:rFonts w:hint="eastAsia"/>
           <w:lang w:val="fr-FR"/>
         </w:rPr>
-        <w:t>测试：改为使用torch的dataloader，</w:t>
-      </w:r>
-      <w:proofErr w:type="gramStart"/>
-      <w:r>
-        <w:rPr>
-          <w:rFonts w:hint="eastAsia"/>
-          <w:lang w:val="fr-FR"/>
-        </w:rPr>
-        <w:t>再只在</w:t>
-      </w:r>
-      <w:proofErr w:type="gramEnd"/>
-      <w:r>
-        <w:rPr>
-          <w:rFonts w:hint="eastAsia"/>
-          <w:lang w:val="fr-FR"/>
-        </w:rPr>
-        <w:t>validation set上跑一遍看时长</w:t>
-      </w:r>
-    </w:p>
-    <w:p>
-      <w:pPr>
-        <w:rPr>
-          <w:rFonts w:hint="eastAsia"/>
-          <w:lang w:val="fr-FR"/>
-        </w:rPr>
-      </w:pPr>
-    </w:p>
-    <w:p>
-      <w:pPr>
-        <w:rPr>
-          <w:rFonts w:hint="eastAsia"/>
-          <w:lang w:val="fr-FR"/>
-        </w:rPr>
-      </w:pPr>
-    </w:p>
-    <w:p>
-      <w:pPr>
-        <w:rPr>
-          <w:rFonts w:hint="eastAsia"/>
-          <w:lang w:val="fr-FR"/>
-        </w:rPr>
-      </w:pPr>
-    </w:p>
-    <w:p>
-      <w:pPr>
-        <w:rPr>
-          <w:rFonts w:hint="eastAsia"/>
-        </w:rPr>
-      </w:pPr>
+        <w:t>测试：改为使用torch的dataloader，再只在validation set上跑一遍看时长</w:t>
+      </w:r>
+    </w:p>
+    <w:p>
+      <w:pPr>
+        <w:rPr>
+          <w:rFonts w:hint="eastAsia"/>
+          <w:lang w:val="fr-FR"/>
+        </w:rPr>
+      </w:pPr>
+    </w:p>
+    <w:p>
+      <w:pPr>
+        <w:rPr>
+          <w:rFonts w:hint="eastAsia"/>
+          <w:lang w:val="fr-FR"/>
+        </w:rPr>
+      </w:pPr>
+    </w:p>
+    <w:p>
+      <w:pPr>
+        <w:rPr>
+          <w:rFonts w:hint="eastAsia"/>
+          <w:lang w:val="fr-FR"/>
+        </w:rPr>
+      </w:pPr>
+    </w:p>
+    <w:p>
       <w:r>
         <w:rPr>
           <w:rFonts w:hint="eastAsia"/>
@@ -1252,6 +1100,24 @@
       </w:r>
       <w:r>
         <w:t>odo:</w:t>
+      </w:r>
+    </w:p>
+    <w:p>
+      <w:pPr>
+        <w:pStyle w:val="a9"/>
+        <w:numPr>
+          <w:ilvl w:val="0"/>
+          <w:numId w:val="12"/>
+        </w:numPr>
+        <w:rPr>
+          <w:rFonts w:hint="eastAsia"/>
+        </w:rPr>
+      </w:pPr>
+      <w:r>
+        <w:rPr>
+          <w:rFonts w:hint="eastAsia"/>
+        </w:rPr>
+        <w:t>实例化model使用model_config</w:t>
       </w:r>
     </w:p>
     <w:p>
@@ -2380,6 +2246,95 @@
       <w:lvlJc w:val="right"/>
       <w:pPr>
         <w:ind w:left="4320" w:hanging="440"/>
+      </w:pPr>
+    </w:lvl>
+  </w:abstractNum>
+  <w:abstractNum w:abstractNumId="11" w15:restartNumberingAfterBreak="0">
+    <w:nsid w:val="69536321"/>
+    <w:multiLevelType w:val="hybridMultilevel"/>
+    <w:tmpl w:val="6128D462"/>
+    <w:lvl w:ilvl="0" w:tplc="D2BADA46">
+      <w:start w:val="1"/>
+      <w:numFmt w:val="decimal"/>
+      <w:lvlText w:val="%1."/>
+      <w:lvlJc w:val="left"/>
+      <w:pPr>
+        <w:ind w:left="360" w:hanging="360"/>
+      </w:pPr>
+      <w:rPr>
+        <w:rFonts w:hint="default"/>
+      </w:rPr>
+    </w:lvl>
+    <w:lvl w:ilvl="1" w:tplc="04090019" w:tentative="1">
+      <w:start w:val="1"/>
+      <w:numFmt w:val="lowerLetter"/>
+      <w:lvlText w:val="%2)"/>
+      <w:lvlJc w:val="left"/>
+      <w:pPr>
+        <w:ind w:left="880" w:hanging="440"/>
+      </w:pPr>
+    </w:lvl>
+    <w:lvl w:ilvl="2" w:tplc="0409001B" w:tentative="1">
+      <w:start w:val="1"/>
+      <w:numFmt w:val="lowerRoman"/>
+      <w:lvlText w:val="%3."/>
+      <w:lvlJc w:val="right"/>
+      <w:pPr>
+        <w:ind w:left="1320" w:hanging="440"/>
+      </w:pPr>
+    </w:lvl>
+    <w:lvl w:ilvl="3" w:tplc="0409000F" w:tentative="1">
+      <w:start w:val="1"/>
+      <w:numFmt w:val="decimal"/>
+      <w:lvlText w:val="%4."/>
+      <w:lvlJc w:val="left"/>
+      <w:pPr>
+        <w:ind w:left="1760" w:hanging="440"/>
+      </w:pPr>
+    </w:lvl>
+    <w:lvl w:ilvl="4" w:tplc="04090019" w:tentative="1">
+      <w:start w:val="1"/>
+      <w:numFmt w:val="lowerLetter"/>
+      <w:lvlText w:val="%5)"/>
+      <w:lvlJc w:val="left"/>
+      <w:pPr>
+        <w:ind w:left="2200" w:hanging="440"/>
+      </w:pPr>
+    </w:lvl>
+    <w:lvl w:ilvl="5" w:tplc="0409001B" w:tentative="1">
+      <w:start w:val="1"/>
+      <w:numFmt w:val="lowerRoman"/>
+      <w:lvlText w:val="%6."/>
+      <w:lvlJc w:val="right"/>
+      <w:pPr>
+        <w:ind w:left="2640" w:hanging="440"/>
+      </w:pPr>
+    </w:lvl>
+    <w:lvl w:ilvl="6" w:tplc="0409000F" w:tentative="1">
+      <w:start w:val="1"/>
+      <w:numFmt w:val="decimal"/>
+      <w:lvlText w:val="%7."/>
+      <w:lvlJc w:val="left"/>
+      <w:pPr>
+        <w:ind w:left="3080" w:hanging="440"/>
+      </w:pPr>
+    </w:lvl>
+    <w:lvl w:ilvl="7" w:tplc="04090019" w:tentative="1">
+      <w:start w:val="1"/>
+      <w:numFmt w:val="lowerLetter"/>
+      <w:lvlText w:val="%8)"/>
+      <w:lvlJc w:val="left"/>
+      <w:pPr>
+        <w:ind w:left="3520" w:hanging="440"/>
+      </w:pPr>
+    </w:lvl>
+    <w:lvl w:ilvl="8" w:tplc="0409001B" w:tentative="1">
+      <w:start w:val="1"/>
+      <w:numFmt w:val="lowerRoman"/>
+      <w:lvlText w:val="%9."/>
+      <w:lvlJc w:val="right"/>
+      <w:pPr>
+        <w:ind w:left="3960" w:hanging="440"/>
       </w:pPr>
     </w:lvl>
   </w:abstractNum>
@@ -2415,6 +2370,9 @@
   </w:num>
   <w:num w:numId="11" w16cid:durableId="787048811">
     <w:abstractNumId w:val="2"/>
+  </w:num>
+  <w:num w:numId="12" w16cid:durableId="1036613041">
+    <w:abstractNumId w:val="11"/>
   </w:num>
 </w:numbering>
 </file>

</xml_diff>

<commit_message>
start learning tuning experiment
</commit_message>
<xml_diff>
--- a/作业记录.docx
+++ b/作业记录.docx
@@ -188,17 +188,18 @@
     </w:p>
     <w:p>
       <w:pPr>
-        <w:rPr>
-          <w:rFonts w:hint="eastAsia"/>
-        </w:rPr>
-      </w:pPr>
-    </w:p>
-    <w:p>
-      <w:pPr>
-        <w:rPr>
-          <w:rFonts w:hint="eastAsia"/>
-        </w:rPr>
-      </w:pPr>
+        <w:widowControl/>
+        <w:jc w:val="left"/>
+        <w:rPr>
+          <w:rFonts w:hint="eastAsia"/>
+        </w:rPr>
+      </w:pPr>
+      <w:r>
+        <w:rPr>
+          <w:rFonts w:hint="eastAsia"/>
+        </w:rPr>
+        <w:br w:type="page"/>
+      </w:r>
     </w:p>
     <w:p>
       <w:pPr>
@@ -214,33 +215,8 @@
           <w:b/>
           <w:bCs/>
         </w:rPr>
-        <w:t>Details</w:t>
-      </w:r>
-    </w:p>
-    <w:p>
-      <w:pPr>
-        <w:rPr>
-          <w:rFonts w:hint="eastAsia"/>
-        </w:rPr>
-      </w:pPr>
-    </w:p>
-    <w:p>
-      <w:pPr>
-        <w:rPr>
-          <w:rFonts w:hint="eastAsia"/>
-        </w:rPr>
-      </w:pPr>
-      <w:r>
-        <w:rPr>
-          <w:rFonts w:hint="eastAsia"/>
-        </w:rPr>
-        <w:t>训练</w:t>
-      </w:r>
-      <w:r>
-        <w:rPr>
-          <w:rFonts w:hint="eastAsia"/>
-        </w:rPr>
-        <w:t>：</w:t>
+        <w:lastRenderedPageBreak/>
+        <w:t>训练：</w:t>
       </w:r>
     </w:p>
     <w:p>
@@ -451,7 +427,6 @@
         <w:pStyle w:val="a9"/>
         <w:ind w:left="360"/>
         <w:rPr>
-          <w:rFonts w:hint="eastAsia"/>
           <w:u w:val="single"/>
         </w:rPr>
       </w:pPr>
@@ -461,6 +436,23 @@
           <w:u w:val="single"/>
         </w:rPr>
         <w:t>工具：wandb</w:t>
+      </w:r>
+    </w:p>
+    <w:p>
+      <w:pPr>
+        <w:pStyle w:val="a9"/>
+        <w:ind w:left="360"/>
+        <w:rPr>
+          <w:rFonts w:hint="eastAsia"/>
+          <w:lang w:val="fr-FR"/>
+        </w:rPr>
+      </w:pPr>
+      <w:r>
+        <w:rPr>
+          <w:rFonts w:hint="eastAsia"/>
+          <w:lang w:val="fr-FR"/>
+        </w:rPr>
+        <w:t>Log记录最后一步</w:t>
       </w:r>
     </w:p>
     <w:p>
@@ -537,11 +529,15 @@
       <w:pPr>
         <w:rPr>
           <w:rFonts w:hint="eastAsia"/>
-        </w:rPr>
-      </w:pPr>
-      <w:r>
-        <w:rPr>
-          <w:rFonts w:hint="eastAsia"/>
+          <w:b/>
+          <w:bCs/>
+        </w:rPr>
+      </w:pPr>
+      <w:r>
+        <w:rPr>
+          <w:rFonts w:hint="eastAsia"/>
+          <w:b/>
+          <w:bCs/>
         </w:rPr>
         <w:t>推理：</w:t>
       </w:r>
@@ -582,12 +578,24 @@
         <w:t>Top-p sampling</w:t>
       </w:r>
     </w:p>
-    <w:p>
-      <w:pPr>
-        <w:rPr>
-          <w:rFonts w:hint="eastAsia"/>
-        </w:rPr>
-      </w:pPr>
+    <w:p/>
+    <w:p/>
+    <w:p>
+      <w:pPr>
+        <w:rPr>
+          <w:rFonts w:hint="eastAsia"/>
+          <w:b/>
+          <w:bCs/>
+        </w:rPr>
+      </w:pPr>
+      <w:r>
+        <w:rPr>
+          <w:rFonts w:hint="eastAsia"/>
+          <w:b/>
+          <w:bCs/>
+        </w:rPr>
+        <w:t>测试：</w:t>
+      </w:r>
     </w:p>
     <w:p>
       <w:pPr>
@@ -745,6 +753,21 @@
         </w:rPr>
         <w:t>完整测试：测试代码在完整数据集上的效果</w:t>
       </w:r>
+      <w:r>
+        <w:rPr>
+          <w:rFonts w:hint="eastAsia"/>
+          <w:lang w:val="fr-FR"/>
+        </w:rPr>
+        <w:t xml:space="preserve"> - </w:t>
+      </w:r>
+      <w:r>
+        <w:rPr>
+          <w:rFonts w:hint="eastAsia"/>
+          <w:color w:val="92D050"/>
+          <w:lang w:val="fr-FR"/>
+        </w:rPr>
+        <w:t>pass</w:t>
+      </w:r>
     </w:p>
     <w:p>
       <w:pPr>
@@ -783,12 +806,16 @@
       <w:pPr>
         <w:rPr>
           <w:rFonts w:hint="eastAsia"/>
-          <w:lang w:val="fr-FR"/>
-        </w:rPr>
-      </w:pPr>
-      <w:r>
-        <w:rPr>
-          <w:rFonts w:hint="eastAsia"/>
+          <w:b/>
+          <w:bCs/>
+          <w:lang w:val="fr-FR"/>
+        </w:rPr>
+      </w:pPr>
+      <w:r>
+        <w:rPr>
+          <w:rFonts w:hint="eastAsia"/>
+          <w:b/>
+          <w:bCs/>
           <w:lang w:val="fr-FR"/>
         </w:rPr>
         <w:t>代码学习：</w:t>
@@ -811,7 +838,6 @@
           <w:rFonts w:hint="eastAsia"/>
           <w:lang w:val="fr-FR"/>
         </w:rPr>
-        <w:lastRenderedPageBreak/>
         <w:t>设置device：</w:t>
       </w:r>
     </w:p>
@@ -932,19 +958,25 @@
     <w:p>
       <w:pPr>
         <w:rPr>
-          <w:lang w:val="fr-FR"/>
-        </w:rPr>
-      </w:pPr>
-    </w:p>
-    <w:p>
-      <w:pPr>
-        <w:rPr>
-          <w:lang w:val="fr-FR"/>
-        </w:rPr>
-      </w:pPr>
-      <w:r>
-        <w:rPr>
-          <w:rFonts w:hint="eastAsia"/>
+          <w:rFonts w:hint="eastAsia"/>
+          <w:lang w:val="fr-FR"/>
+        </w:rPr>
+      </w:pPr>
+    </w:p>
+    <w:p>
+      <w:pPr>
+        <w:rPr>
+          <w:rFonts w:hint="eastAsia"/>
+          <w:b/>
+          <w:bCs/>
+          <w:lang w:val="fr-FR"/>
+        </w:rPr>
+      </w:pPr>
+      <w:r>
+        <w:rPr>
+          <w:rFonts w:hint="eastAsia"/>
+          <w:b/>
+          <w:bCs/>
           <w:lang w:val="fr-FR"/>
         </w:rPr>
         <w:t>参数：</w:t>
@@ -985,15 +1017,37 @@
       <w:pPr>
         <w:rPr>
           <w:rFonts w:hint="eastAsia"/>
-          <w:lang w:val="fr-FR"/>
-        </w:rPr>
-      </w:pPr>
-      <w:r>
-        <w:rPr>
-          <w:rFonts w:hint="eastAsia"/>
-          <w:lang w:val="fr-FR"/>
-        </w:rPr>
-        <w:t>问题：</w:t>
+          <w:b/>
+          <w:bCs/>
+          <w:lang w:val="fr-FR"/>
+        </w:rPr>
+      </w:pPr>
+      <w:r>
+        <w:rPr>
+          <w:rFonts w:hint="eastAsia"/>
+          <w:b/>
+          <w:bCs/>
+          <w:lang w:val="fr-FR"/>
+        </w:rPr>
+        <w:t>问题</w:t>
+      </w:r>
+      <w:r>
+        <w:rPr>
+          <w:rFonts w:hint="eastAsia"/>
+          <w:b/>
+          <w:bCs/>
+          <w:lang w:val="fr-FR"/>
+        </w:rPr>
+        <w:t>及解决</w:t>
+      </w:r>
+      <w:r>
+        <w:rPr>
+          <w:rFonts w:hint="eastAsia"/>
+          <w:b/>
+          <w:bCs/>
+          <w:lang w:val="fr-FR"/>
+        </w:rPr>
+        <w:t>：</w:t>
       </w:r>
     </w:p>
     <w:p>
@@ -1092,13 +1146,26 @@
       </w:pPr>
     </w:p>
     <w:p>
-      <w:r>
-        <w:rPr>
-          <w:rFonts w:hint="eastAsia"/>
+      <w:pPr>
+        <w:rPr>
+          <w:rFonts w:hint="eastAsia"/>
+          <w:b/>
+          <w:bCs/>
+        </w:rPr>
+      </w:pPr>
+      <w:r>
+        <w:rPr>
+          <w:rFonts w:hint="eastAsia"/>
+          <w:b/>
+          <w:bCs/>
         </w:rPr>
         <w:t>T</w:t>
       </w:r>
       <w:r>
+        <w:rPr>
+          <w:b/>
+          <w:bCs/>
+        </w:rPr>
         <w:t>odo:</w:t>
       </w:r>
     </w:p>
@@ -1107,11 +1174,8 @@
         <w:pStyle w:val="a9"/>
         <w:numPr>
           <w:ilvl w:val="0"/>
-          <w:numId w:val="12"/>
+          <w:numId w:val="13"/>
         </w:numPr>
-        <w:rPr>
-          <w:rFonts w:hint="eastAsia"/>
-        </w:rPr>
       </w:pPr>
       <w:r>
         <w:rPr>
@@ -1122,11 +1186,21 @@
     </w:p>
     <w:p>
       <w:pPr>
-        <w:rPr>
-          <w:rFonts w:hint="eastAsia"/>
-          <w:lang w:val="fr-FR"/>
-        </w:rPr>
-      </w:pPr>
+        <w:pStyle w:val="a9"/>
+        <w:numPr>
+          <w:ilvl w:val="0"/>
+          <w:numId w:val="13"/>
+        </w:numPr>
+        <w:rPr>
+          <w:rFonts w:hint="eastAsia"/>
+        </w:rPr>
+      </w:pPr>
+      <w:r>
+        <w:rPr>
+          <w:rFonts w:hint="eastAsia"/>
+        </w:rPr>
+        <w:t>将wandb config加入program parameter</w:t>
+      </w:r>
     </w:p>
     <w:sectPr>
       <w:pgSz w:w="11906" w:h="16838"/>
@@ -1870,6 +1944,118 @@
     </w:lvl>
   </w:abstractNum>
   <w:abstractNum w:abstractNumId="7" w15:restartNumberingAfterBreak="0">
+    <w:nsid w:val="478163C3"/>
+    <w:multiLevelType w:val="hybridMultilevel"/>
+    <w:tmpl w:val="2BF26300"/>
+    <w:lvl w:ilvl="0" w:tplc="9A401B5E">
+      <w:numFmt w:val="bullet"/>
+      <w:lvlText w:val="-"/>
+      <w:lvlJc w:val="left"/>
+      <w:pPr>
+        <w:ind w:left="360" w:hanging="360"/>
+      </w:pPr>
+      <w:rPr>
+        <w:rFonts w:ascii="等线" w:eastAsia="等线" w:hAnsi="等线" w:cstheme="minorBidi" w:hint="eastAsia"/>
+      </w:rPr>
+    </w:lvl>
+    <w:lvl w:ilvl="1" w:tplc="04090003" w:tentative="1">
+      <w:start w:val="1"/>
+      <w:numFmt w:val="bullet"/>
+      <w:lvlText w:val=""/>
+      <w:lvlJc w:val="left"/>
+      <w:pPr>
+        <w:ind w:left="880" w:hanging="440"/>
+      </w:pPr>
+      <w:rPr>
+        <w:rFonts w:ascii="Wingdings" w:hAnsi="Wingdings" w:hint="default"/>
+      </w:rPr>
+    </w:lvl>
+    <w:lvl w:ilvl="2" w:tplc="04090005" w:tentative="1">
+      <w:start w:val="1"/>
+      <w:numFmt w:val="bullet"/>
+      <w:lvlText w:val=""/>
+      <w:lvlJc w:val="left"/>
+      <w:pPr>
+        <w:ind w:left="1320" w:hanging="440"/>
+      </w:pPr>
+      <w:rPr>
+        <w:rFonts w:ascii="Wingdings" w:hAnsi="Wingdings" w:hint="default"/>
+      </w:rPr>
+    </w:lvl>
+    <w:lvl w:ilvl="3" w:tplc="04090001" w:tentative="1">
+      <w:start w:val="1"/>
+      <w:numFmt w:val="bullet"/>
+      <w:lvlText w:val=""/>
+      <w:lvlJc w:val="left"/>
+      <w:pPr>
+        <w:ind w:left="1760" w:hanging="440"/>
+      </w:pPr>
+      <w:rPr>
+        <w:rFonts w:ascii="Wingdings" w:hAnsi="Wingdings" w:hint="default"/>
+      </w:rPr>
+    </w:lvl>
+    <w:lvl w:ilvl="4" w:tplc="04090003" w:tentative="1">
+      <w:start w:val="1"/>
+      <w:numFmt w:val="bullet"/>
+      <w:lvlText w:val=""/>
+      <w:lvlJc w:val="left"/>
+      <w:pPr>
+        <w:ind w:left="2200" w:hanging="440"/>
+      </w:pPr>
+      <w:rPr>
+        <w:rFonts w:ascii="Wingdings" w:hAnsi="Wingdings" w:hint="default"/>
+      </w:rPr>
+    </w:lvl>
+    <w:lvl w:ilvl="5" w:tplc="04090005" w:tentative="1">
+      <w:start w:val="1"/>
+      <w:numFmt w:val="bullet"/>
+      <w:lvlText w:val=""/>
+      <w:lvlJc w:val="left"/>
+      <w:pPr>
+        <w:ind w:left="2640" w:hanging="440"/>
+      </w:pPr>
+      <w:rPr>
+        <w:rFonts w:ascii="Wingdings" w:hAnsi="Wingdings" w:hint="default"/>
+      </w:rPr>
+    </w:lvl>
+    <w:lvl w:ilvl="6" w:tplc="04090001" w:tentative="1">
+      <w:start w:val="1"/>
+      <w:numFmt w:val="bullet"/>
+      <w:lvlText w:val=""/>
+      <w:lvlJc w:val="left"/>
+      <w:pPr>
+        <w:ind w:left="3080" w:hanging="440"/>
+      </w:pPr>
+      <w:rPr>
+        <w:rFonts w:ascii="Wingdings" w:hAnsi="Wingdings" w:hint="default"/>
+      </w:rPr>
+    </w:lvl>
+    <w:lvl w:ilvl="7" w:tplc="04090003" w:tentative="1">
+      <w:start w:val="1"/>
+      <w:numFmt w:val="bullet"/>
+      <w:lvlText w:val=""/>
+      <w:lvlJc w:val="left"/>
+      <w:pPr>
+        <w:ind w:left="3520" w:hanging="440"/>
+      </w:pPr>
+      <w:rPr>
+        <w:rFonts w:ascii="Wingdings" w:hAnsi="Wingdings" w:hint="default"/>
+      </w:rPr>
+    </w:lvl>
+    <w:lvl w:ilvl="8" w:tplc="04090005" w:tentative="1">
+      <w:start w:val="1"/>
+      <w:numFmt w:val="bullet"/>
+      <w:lvlText w:val=""/>
+      <w:lvlJc w:val="left"/>
+      <w:pPr>
+        <w:ind w:left="3960" w:hanging="440"/>
+      </w:pPr>
+      <w:rPr>
+        <w:rFonts w:ascii="Wingdings" w:hAnsi="Wingdings" w:hint="default"/>
+      </w:rPr>
+    </w:lvl>
+  </w:abstractNum>
+  <w:abstractNum w:abstractNumId="8" w15:restartNumberingAfterBreak="0">
     <w:nsid w:val="47AA1B63"/>
     <w:multiLevelType w:val="hybridMultilevel"/>
     <w:tmpl w:val="505664DA"/>
@@ -1958,7 +2144,7 @@
       </w:pPr>
     </w:lvl>
   </w:abstractNum>
-  <w:abstractNum w:abstractNumId="8" w15:restartNumberingAfterBreak="0">
+  <w:abstractNum w:abstractNumId="9" w15:restartNumberingAfterBreak="0">
     <w:nsid w:val="5B9B1623"/>
     <w:multiLevelType w:val="hybridMultilevel"/>
     <w:tmpl w:val="E76CACAE"/>
@@ -2047,7 +2233,7 @@
       </w:pPr>
     </w:lvl>
   </w:abstractNum>
-  <w:abstractNum w:abstractNumId="9" w15:restartNumberingAfterBreak="0">
+  <w:abstractNum w:abstractNumId="10" w15:restartNumberingAfterBreak="0">
     <w:nsid w:val="62B172BF"/>
     <w:multiLevelType w:val="hybridMultilevel"/>
     <w:tmpl w:val="1D66575A"/>
@@ -2160,7 +2346,7 @@
       </w:rPr>
     </w:lvl>
   </w:abstractNum>
-  <w:abstractNum w:abstractNumId="10" w15:restartNumberingAfterBreak="0">
+  <w:abstractNum w:abstractNumId="11" w15:restartNumberingAfterBreak="0">
     <w:nsid w:val="643F0A79"/>
     <w:multiLevelType w:val="hybridMultilevel"/>
     <w:tmpl w:val="07BE7228"/>
@@ -2249,7 +2435,7 @@
       </w:pPr>
     </w:lvl>
   </w:abstractNum>
-  <w:abstractNum w:abstractNumId="11" w15:restartNumberingAfterBreak="0">
+  <w:abstractNum w:abstractNumId="12" w15:restartNumberingAfterBreak="0">
     <w:nsid w:val="69536321"/>
     <w:multiLevelType w:val="hybridMultilevel"/>
     <w:tmpl w:val="6128D462"/>
@@ -2342,22 +2528,22 @@
     <w:abstractNumId w:val="0"/>
   </w:num>
   <w:num w:numId="2" w16cid:durableId="1578438118">
-    <w:abstractNumId w:val="10"/>
+    <w:abstractNumId w:val="11"/>
   </w:num>
   <w:num w:numId="3" w16cid:durableId="867763447">
     <w:abstractNumId w:val="6"/>
   </w:num>
   <w:num w:numId="4" w16cid:durableId="864565369">
-    <w:abstractNumId w:val="7"/>
+    <w:abstractNumId w:val="8"/>
   </w:num>
   <w:num w:numId="5" w16cid:durableId="350112403">
-    <w:abstractNumId w:val="8"/>
+    <w:abstractNumId w:val="9"/>
   </w:num>
   <w:num w:numId="6" w16cid:durableId="1786385003">
     <w:abstractNumId w:val="1"/>
   </w:num>
   <w:num w:numId="7" w16cid:durableId="1036200526">
-    <w:abstractNumId w:val="9"/>
+    <w:abstractNumId w:val="10"/>
   </w:num>
   <w:num w:numId="8" w16cid:durableId="1890530902">
     <w:abstractNumId w:val="5"/>
@@ -2372,7 +2558,10 @@
     <w:abstractNumId w:val="2"/>
   </w:num>
   <w:num w:numId="12" w16cid:durableId="1036613041">
-    <w:abstractNumId w:val="11"/>
+    <w:abstractNumId w:val="12"/>
+  </w:num>
+  <w:num w:numId="13" w16cid:durableId="1261572405">
+    <w:abstractNumId w:val="7"/>
   </w:num>
 </w:numbering>
 </file>

</xml_diff>

<commit_message>
add JIT (with experiments)
</commit_message>
<xml_diff>
--- a/作业记录.docx
+++ b/作业记录.docx
@@ -374,6 +374,9 @@
       <w:pPr>
         <w:pStyle w:val="a9"/>
         <w:ind w:left="880"/>
+        <w:rPr>
+          <w:rFonts w:hint="eastAsia"/>
+        </w:rPr>
       </w:pPr>
       <w:r>
         <w:rPr>
@@ -420,6 +423,9 @@
       <w:pPr>
         <w:pStyle w:val="a9"/>
         <w:ind w:left="880"/>
+        <w:rPr>
+          <w:rFonts w:hint="eastAsia"/>
+        </w:rPr>
       </w:pPr>
     </w:p>
     <w:p>
@@ -430,6 +436,7 @@
           <w:numId w:val="4"/>
         </w:numPr>
         <w:rPr>
+          <w:rFonts w:hint="eastAsia"/>
           <w:color w:val="00B0F0"/>
         </w:rPr>
       </w:pPr>
@@ -1354,9 +1361,6 @@
           <w:ilvl w:val="0"/>
           <w:numId w:val="13"/>
         </w:numPr>
-        <w:rPr>
-          <w:rFonts w:hint="eastAsia"/>
-        </w:rPr>
       </w:pPr>
       <w:r>
         <w:rPr>
@@ -1388,21 +1392,21 @@
         <w:rPr>
           <w:rFonts w:hint="eastAsia"/>
         </w:rPr>
-        <w:t>查找学习learning rate论文，指定</w:t>
+        <w:t>将</w:t>
       </w:r>
       <w:proofErr w:type="spellStart"/>
       <w:r>
         <w:rPr>
           <w:rFonts w:hint="eastAsia"/>
         </w:rPr>
-        <w:t>lr</w:t>
+        <w:t>wandb</w:t>
       </w:r>
       <w:proofErr w:type="spellEnd"/>
       <w:r>
         <w:rPr>
           <w:rFonts w:hint="eastAsia"/>
         </w:rPr>
-        <w:t xml:space="preserve"> search strategy</w:t>
+        <w:t xml:space="preserve"> config加入program parameter</w:t>
       </w:r>
     </w:p>
     <w:p>
@@ -1412,26 +1416,57 @@
           <w:ilvl w:val="0"/>
           <w:numId w:val="13"/>
         </w:numPr>
-      </w:pPr>
-      <w:r>
-        <w:rPr>
-          <w:rFonts w:hint="eastAsia"/>
-        </w:rPr>
-        <w:t>将</w:t>
+        <w:rPr>
+          <w:rFonts w:hint="eastAsia"/>
+        </w:rPr>
+      </w:pPr>
+      <w:r>
+        <w:rPr>
+          <w:rFonts w:hint="eastAsia"/>
+        </w:rPr>
+        <w:t>写一个</w:t>
       </w:r>
       <w:proofErr w:type="spellStart"/>
       <w:r>
         <w:rPr>
           <w:rFonts w:hint="eastAsia"/>
         </w:rPr>
-        <w:t>wandb</w:t>
+        <w:t>init_model_opt</w:t>
       </w:r>
       <w:proofErr w:type="spellEnd"/>
       <w:r>
         <w:rPr>
           <w:rFonts w:hint="eastAsia"/>
         </w:rPr>
-        <w:t xml:space="preserve"> config加入program parameter</w:t>
+        <w:t>函数（接受</w:t>
+      </w:r>
+      <w:proofErr w:type="spellStart"/>
+      <w:r>
+        <w:rPr>
+          <w:rFonts w:hint="eastAsia"/>
+        </w:rPr>
+        <w:t>args.load_path</w:t>
+      </w:r>
+      <w:proofErr w:type="spellEnd"/>
+      <w:r>
+        <w:rPr>
+          <w:rFonts w:hint="eastAsia"/>
+        </w:rPr>
+        <w:t xml:space="preserve">, </w:t>
+      </w:r>
+      <w:proofErr w:type="spellStart"/>
+      <w:r>
+        <w:rPr>
+          <w:rFonts w:hint="eastAsia"/>
+        </w:rPr>
+        <w:t>args.dis_train</w:t>
+      </w:r>
+      <w:proofErr w:type="spellEnd"/>
+      <w:r>
+        <w:rPr>
+          <w:rFonts w:hint="eastAsia"/>
+        </w:rPr>
+        <w:t>）</w:t>
       </w:r>
     </w:p>
     <w:p>
@@ -1449,16 +1484,22 @@
         <w:rPr>
           <w:rFonts w:hint="eastAsia"/>
         </w:rPr>
-        <w:t>设置多卡训练</w:t>
-      </w:r>
-      <w:r>
-        <w:t xml:space="preserve">, scale the </w:t>
+        <w:t>查找学习learning rate论文，指定</w:t>
       </w:r>
       <w:proofErr w:type="spellStart"/>
       <w:r>
+        <w:rPr>
+          <w:rFonts w:hint="eastAsia"/>
+        </w:rPr>
         <w:t>lr</w:t>
       </w:r>
       <w:proofErr w:type="spellEnd"/>
+      <w:r>
+        <w:rPr>
+          <w:rFonts w:hint="eastAsia"/>
+        </w:rPr>
+        <w:t xml:space="preserve"> search strategy</w:t>
+      </w:r>
     </w:p>
     <w:p>
       <w:pPr>

</xml_diff>

<commit_message>
add new tokenization func, which uses constant memeory
</commit_message>
<xml_diff>
--- a/作业记录.docx
+++ b/作业记录.docx
@@ -37,33 +37,17 @@
         </w:rPr>
         <w:t xml:space="preserve">手写了transformer LM：Linear, Embedding, MHA, </w:t>
       </w:r>
-      <w:proofErr w:type="spellStart"/>
-      <w:r>
-        <w:rPr>
-          <w:rFonts w:hint="eastAsia"/>
-        </w:rPr>
-        <w:t>RoPE</w:t>
-      </w:r>
-      <w:proofErr w:type="spellEnd"/>
-      <w:r>
-        <w:rPr>
-          <w:rFonts w:hint="eastAsia"/>
-        </w:rPr>
-        <w:t xml:space="preserve">, </w:t>
-      </w:r>
-      <w:proofErr w:type="spellStart"/>
-      <w:r>
-        <w:rPr>
-          <w:rFonts w:hint="eastAsia"/>
-        </w:rPr>
-        <w:t>SwiGLU</w:t>
-      </w:r>
-      <w:proofErr w:type="spellEnd"/>
-      <w:r>
-        <w:rPr>
-          <w:rFonts w:hint="eastAsia"/>
-        </w:rPr>
-        <w:t>, etc.</w:t>
+      <w:r>
+        <w:rPr>
+          <w:rFonts w:hint="eastAsia"/>
+        </w:rPr>
+        <w:t xml:space="preserve">RoPE, </w:t>
+      </w:r>
+      <w:r>
+        <w:rPr>
+          <w:rFonts w:hint="eastAsia"/>
+        </w:rPr>
+        <w:t>SwiGLU, etc.</w:t>
       </w:r>
     </w:p>
     <w:p>
@@ -145,21 +129,7 @@
         <w:rPr>
           <w:rFonts w:hint="eastAsia"/>
         </w:rPr>
-        <w:t>，计算了不同模块的FLOPs占比，以及</w:t>
-      </w:r>
-      <w:proofErr w:type="gramStart"/>
-      <w:r>
-        <w:rPr>
-          <w:rFonts w:hint="eastAsia"/>
-        </w:rPr>
-        <w:t>占比随</w:t>
-      </w:r>
-      <w:proofErr w:type="gramEnd"/>
-      <w:r>
-        <w:rPr>
-          <w:rFonts w:hint="eastAsia"/>
-        </w:rPr>
-        <w:t>model size的变化</w:t>
+        <w:t>，计算了不同模块的FLOPs占比，以及占比随model size的变化</w:t>
       </w:r>
     </w:p>
     <w:p>
@@ -177,21 +147,7 @@
         <w:rPr>
           <w:rFonts w:hint="eastAsia"/>
         </w:rPr>
-        <w:t>手写了</w:t>
-      </w:r>
-      <w:proofErr w:type="spellStart"/>
-      <w:r>
-        <w:rPr>
-          <w:rFonts w:hint="eastAsia"/>
-        </w:rPr>
-        <w:t>AdamW</w:t>
-      </w:r>
-      <w:proofErr w:type="spellEnd"/>
-      <w:r>
-        <w:rPr>
-          <w:rFonts w:hint="eastAsia"/>
-        </w:rPr>
-        <w:t xml:space="preserve"> optimizer</w:t>
+        <w:t>手写了AdamW optimizer</w:t>
       </w:r>
       <w:r>
         <w:rPr>
@@ -203,16 +159,8 @@
         <w:rPr>
           <w:rFonts w:hint="eastAsia"/>
         </w:rPr>
-        <w:t xml:space="preserve">估算了model训练时的peak </w:t>
-      </w:r>
-      <w:proofErr w:type="spellStart"/>
-      <w:r>
-        <w:rPr>
-          <w:rFonts w:hint="eastAsia"/>
-        </w:rPr>
-        <w:t>memeory</w:t>
-      </w:r>
-      <w:proofErr w:type="spellEnd"/>
+        <w:t>估算了model训练时的peak memeory</w:t>
+      </w:r>
       <w:r>
         <w:rPr>
           <w:rFonts w:hint="eastAsia"/>
@@ -312,23 +260,7 @@
           <w:rFonts w:hint="eastAsia"/>
           <w:color w:val="00B0F0"/>
         </w:rPr>
-        <w:t>Load data使用自定义stride，而不是</w:t>
-      </w:r>
-      <w:proofErr w:type="spellStart"/>
-      <w:r>
-        <w:rPr>
-          <w:rFonts w:hint="eastAsia"/>
-          <w:color w:val="00B0F0"/>
-        </w:rPr>
-        <w:t>context_length</w:t>
-      </w:r>
-      <w:proofErr w:type="spellEnd"/>
-      <w:r>
-        <w:rPr>
-          <w:rFonts w:hint="eastAsia"/>
-          <w:color w:val="00B0F0"/>
-        </w:rPr>
-        <w:t xml:space="preserve"> + 1</w:t>
+        <w:t>Load data使用自定义stride，而不是context_length + 1</w:t>
       </w:r>
     </w:p>
     <w:p>
@@ -436,6 +368,7 @@
           <w:numId w:val="4"/>
         </w:numPr>
         <w:rPr>
+          <w:rFonts w:hint="eastAsia"/>
           <w:color w:val="00B0F0"/>
         </w:rPr>
       </w:pPr>
@@ -462,27 +395,16 @@
       <w:r>
         <w:rPr>
           <w:rFonts w:hint="eastAsia"/>
-          <w:strike/>
           <w:color w:val="000000" w:themeColor="text1"/>
         </w:rPr>
-        <w:t>Jit编译：</w:t>
-      </w:r>
-      <w:proofErr w:type="spellStart"/>
-      <w:r>
-        <w:rPr>
-          <w:rFonts w:hint="eastAsia"/>
-          <w:strike/>
+        <w:t>Jit编译：torch.compile</w:t>
+      </w:r>
+      <w:r>
+        <w:rPr>
+          <w:rFonts w:hint="eastAsia"/>
           <w:color w:val="000000" w:themeColor="text1"/>
         </w:rPr>
-        <w:t>torch.compile</w:t>
-      </w:r>
-      <w:proofErr w:type="spellEnd"/>
-      <w:r>
-        <w:rPr>
-          <w:rFonts w:hint="eastAsia"/>
-          <w:color w:val="000000" w:themeColor="text1"/>
-        </w:rPr>
-        <w:t>：经过实验+测试后决定放弃：参考experiments/12-30</w:t>
+        <w:t>：</w:t>
       </w:r>
     </w:p>
     <w:p>
@@ -544,19 +466,11 @@
         </w:rPr>
         <w:t xml:space="preserve">validation loss, </w:t>
       </w:r>
-      <w:proofErr w:type="spellStart"/>
-      <w:r>
-        <w:rPr>
-          <w:rFonts w:hint="eastAsia"/>
-        </w:rPr>
-        <w:t>lr</w:t>
-      </w:r>
-      <w:proofErr w:type="spellEnd"/>
-      <w:r>
-        <w:rPr>
-          <w:rFonts w:hint="eastAsia"/>
-        </w:rPr>
-        <w:t>, time</w:t>
+      <w:r>
+        <w:rPr>
+          <w:rFonts w:hint="eastAsia"/>
+        </w:rPr>
+        <w:t>lr, time</w:t>
       </w:r>
     </w:p>
     <w:p>
@@ -573,17 +487,8 @@
           <w:rFonts w:hint="eastAsia"/>
           <w:u w:val="single"/>
         </w:rPr>
-        <w:t>工具：</w:t>
-      </w:r>
-      <w:proofErr w:type="spellStart"/>
-      <w:r>
-        <w:rPr>
-          <w:rFonts w:hint="eastAsia"/>
-          <w:u w:val="single"/>
-        </w:rPr>
-        <w:t>wandb</w:t>
-      </w:r>
-      <w:proofErr w:type="spellEnd"/>
+        <w:t>工具：wandb</w:t>
+      </w:r>
     </w:p>
     <w:p>
       <w:pPr>
@@ -646,23 +551,7 @@
           <w:rFonts w:hint="eastAsia"/>
           <w:color w:val="00B0F0"/>
         </w:rPr>
-        <w:t>保存/恢复</w:t>
-      </w:r>
-      <w:proofErr w:type="spellStart"/>
-      <w:r>
-        <w:rPr>
-          <w:rFonts w:hint="eastAsia"/>
-          <w:color w:val="00B0F0"/>
-        </w:rPr>
-        <w:t>dataloader</w:t>
-      </w:r>
-      <w:proofErr w:type="spellEnd"/>
-      <w:r>
-        <w:rPr>
-          <w:rFonts w:hint="eastAsia"/>
-          <w:color w:val="00B0F0"/>
-        </w:rPr>
-        <w:t xml:space="preserve"> checkpoint</w:t>
+        <w:t>保存/恢复dataloader checkpoint</w:t>
       </w:r>
       <w:r>
         <w:rPr>
@@ -716,19 +605,11 @@
           <w:rFonts w:hint="eastAsia"/>
         </w:rPr>
       </w:pPr>
-      <w:proofErr w:type="spellStart"/>
-      <w:r>
-        <w:rPr>
-          <w:rFonts w:hint="eastAsia"/>
-        </w:rPr>
-        <w:t>Softmax</w:t>
-      </w:r>
-      <w:proofErr w:type="spellEnd"/>
-      <w:r>
-        <w:rPr>
-          <w:rFonts w:hint="eastAsia"/>
-        </w:rPr>
-        <w:t xml:space="preserve"> with temperature scaling</w:t>
+      <w:r>
+        <w:rPr>
+          <w:rFonts w:hint="eastAsia"/>
+        </w:rPr>
+        <w:t>Softmax with temperature scaling</w:t>
       </w:r>
     </w:p>
     <w:p>
@@ -808,6 +689,25 @@
         <w:rPr>
           <w:rFonts w:hint="eastAsia"/>
         </w:rPr>
+        <w:t>（</w:t>
+      </w:r>
+      <w:r>
+        <w:rPr>
+          <w:rFonts w:hint="eastAsia"/>
+          <w:color w:val="92D050"/>
+        </w:rPr>
+        <w:t>pass</w:t>
+      </w:r>
+      <w:r>
+        <w:rPr>
+          <w:rFonts w:hint="eastAsia"/>
+        </w:rPr>
+        <w:t>）</w:t>
+      </w:r>
+      <w:r>
+        <w:rPr>
+          <w:rFonts w:hint="eastAsia"/>
+        </w:rPr>
         <w:t>model</w:t>
       </w:r>
       <w:r>
@@ -832,14 +732,7 @@
         <w:rPr>
           <w:rFonts w:hint="eastAsia"/>
         </w:rPr>
-        <w:t xml:space="preserve"> - </w:t>
-      </w:r>
-      <w:r>
-        <w:rPr>
-          <w:rFonts w:hint="eastAsia"/>
-          <w:color w:val="92D050"/>
-        </w:rPr>
-        <w:t>pass</w:t>
+        <w:t xml:space="preserve"> </w:t>
       </w:r>
     </w:p>
     <w:p>
@@ -934,6 +827,28 @@
           <w:rFonts w:hint="eastAsia"/>
           <w:lang w:val="fr-FR"/>
         </w:rPr>
+        <w:t>（</w:t>
+      </w:r>
+      <w:r>
+        <w:rPr>
+          <w:rFonts w:hint="eastAsia"/>
+          <w:color w:val="92D050"/>
+          <w:lang w:val="fr-FR"/>
+        </w:rPr>
+        <w:t>pass</w:t>
+      </w:r>
+      <w:r>
+        <w:rPr>
+          <w:rFonts w:hint="eastAsia"/>
+          <w:lang w:val="fr-FR"/>
+        </w:rPr>
+        <w:t>）</w:t>
+      </w:r>
+      <w:r>
+        <w:rPr>
+          <w:rFonts w:hint="eastAsia"/>
+          <w:lang w:val="fr-FR"/>
+        </w:rPr>
         <w:t>完整测试：测试代码在完整数据集上的效果</w:t>
       </w:r>
       <w:r>
@@ -941,15 +856,7 @@
           <w:rFonts w:hint="eastAsia"/>
           <w:lang w:val="fr-FR"/>
         </w:rPr>
-        <w:t xml:space="preserve"> - </w:t>
-      </w:r>
-      <w:r>
-        <w:rPr>
-          <w:rFonts w:hint="eastAsia"/>
-          <w:color w:val="92D050"/>
-          <w:lang w:val="fr-FR"/>
-        </w:rPr>
-        <w:t>pass</w:t>
+        <w:t xml:space="preserve"> </w:t>
       </w:r>
     </w:p>
     <w:p>
@@ -1176,33 +1083,11 @@
           <w:rFonts w:hint="eastAsia"/>
         </w:rPr>
       </w:pPr>
-      <w:proofErr w:type="spellStart"/>
-      <w:r>
-        <w:rPr>
-          <w:rFonts w:hint="eastAsia"/>
-        </w:rPr>
-        <w:t>Dataloader</w:t>
-      </w:r>
-      <w:proofErr w:type="spellEnd"/>
-      <w:r>
-        <w:rPr>
-          <w:rFonts w:hint="eastAsia"/>
-        </w:rPr>
-        <w:t>：</w:t>
-      </w:r>
-      <w:proofErr w:type="spellStart"/>
-      <w:r>
-        <w:rPr>
-          <w:rFonts w:hint="eastAsia"/>
-        </w:rPr>
-        <w:t>drop_last</w:t>
-      </w:r>
-      <w:proofErr w:type="spellEnd"/>
-      <w:r>
-        <w:rPr>
-          <w:rFonts w:hint="eastAsia"/>
-        </w:rPr>
-        <w:t xml:space="preserve"> = Tr</w:t>
+      <w:r>
+        <w:rPr>
+          <w:rFonts w:hint="eastAsia"/>
+        </w:rPr>
+        <w:t>Dataloader：drop_last = Tr</w:t>
       </w:r>
       <w:r>
         <w:rPr>
@@ -1323,53 +1208,36 @@
           <w:rFonts w:hint="eastAsia"/>
           <w:lang w:val="fr-FR"/>
         </w:rPr>
-        <w:t>测试：改为使用torch的dataloader，</w:t>
-      </w:r>
-      <w:proofErr w:type="gramStart"/>
-      <w:r>
-        <w:rPr>
-          <w:rFonts w:hint="eastAsia"/>
-          <w:lang w:val="fr-FR"/>
-        </w:rPr>
-        <w:t>再只在</w:t>
-      </w:r>
-      <w:proofErr w:type="gramEnd"/>
-      <w:r>
-        <w:rPr>
-          <w:rFonts w:hint="eastAsia"/>
-          <w:lang w:val="fr-FR"/>
-        </w:rPr>
-        <w:t>validation set上跑一遍看时长</w:t>
-      </w:r>
-    </w:p>
-    <w:p>
-      <w:pPr>
-        <w:rPr>
-          <w:rFonts w:hint="eastAsia"/>
-          <w:lang w:val="fr-FR"/>
-        </w:rPr>
-      </w:pPr>
-    </w:p>
-    <w:p>
-      <w:pPr>
-        <w:rPr>
-          <w:rFonts w:hint="eastAsia"/>
-          <w:lang w:val="fr-FR"/>
-        </w:rPr>
-      </w:pPr>
-    </w:p>
-    <w:p>
-      <w:pPr>
-        <w:rPr>
-          <w:rFonts w:hint="eastAsia"/>
-          <w:lang w:val="fr-FR"/>
-        </w:rPr>
-      </w:pPr>
-    </w:p>
-    <w:p>
-      <w:pPr>
-        <w:rPr>
-          <w:rFonts w:hint="eastAsia"/>
+        <w:t>测试：改为使用torch的dataloader，再只在validation set上跑一遍看时长</w:t>
+      </w:r>
+    </w:p>
+    <w:p>
+      <w:pPr>
+        <w:rPr>
+          <w:rFonts w:hint="eastAsia"/>
+          <w:lang w:val="fr-FR"/>
+        </w:rPr>
+      </w:pPr>
+    </w:p>
+    <w:p>
+      <w:pPr>
+        <w:rPr>
+          <w:rFonts w:hint="eastAsia"/>
+          <w:lang w:val="fr-FR"/>
+        </w:rPr>
+      </w:pPr>
+    </w:p>
+    <w:p>
+      <w:pPr>
+        <w:rPr>
+          <w:rFonts w:hint="eastAsia"/>
+          <w:lang w:val="fr-FR"/>
+        </w:rPr>
+      </w:pPr>
+    </w:p>
+    <w:p>
+      <w:pPr>
+        <w:rPr>
           <w:b/>
           <w:bCs/>
         </w:rPr>
@@ -1395,54 +1263,58 @@
         <w:pStyle w:val="a9"/>
         <w:numPr>
           <w:ilvl w:val="0"/>
-          <w:numId w:val="13"/>
+          <w:numId w:val="15"/>
         </w:numPr>
-      </w:pPr>
-      <w:r>
-        <w:rPr>
-          <w:rFonts w:hint="eastAsia"/>
-        </w:rPr>
-        <w:t>实例化model使用</w:t>
-      </w:r>
-      <w:proofErr w:type="spellStart"/>
-      <w:r>
-        <w:rPr>
-          <w:rFonts w:hint="eastAsia"/>
-        </w:rPr>
-        <w:t>model_config</w:t>
-      </w:r>
-      <w:proofErr w:type="spellEnd"/>
+        <w:rPr>
+          <w:rFonts w:hint="eastAsia"/>
+          <w:b/>
+          <w:bCs/>
+        </w:rPr>
+      </w:pPr>
+      <w:r>
+        <w:rPr>
+          <w:rFonts w:hint="eastAsia"/>
+          <w:b/>
+          <w:bCs/>
+        </w:rPr>
+        <w:t>Silu测试</w:t>
+      </w:r>
     </w:p>
     <w:p>
       <w:pPr>
         <w:pStyle w:val="a9"/>
         <w:numPr>
           <w:ilvl w:val="0"/>
-          <w:numId w:val="13"/>
+          <w:numId w:val="15"/>
         </w:numPr>
-        <w:rPr>
-          <w:rFonts w:hint="eastAsia"/>
-        </w:rPr>
-      </w:pPr>
-      <w:r>
-        <w:rPr>
-          <w:rFonts w:hint="eastAsia"/>
-        </w:rPr>
-        <w:t>将</w:t>
-      </w:r>
-      <w:proofErr w:type="spellStart"/>
-      <w:r>
-        <w:rPr>
-          <w:rFonts w:hint="eastAsia"/>
-        </w:rPr>
-        <w:t>wandb</w:t>
-      </w:r>
-      <w:proofErr w:type="spellEnd"/>
-      <w:r>
-        <w:rPr>
-          <w:rFonts w:hint="eastAsia"/>
-        </w:rPr>
-        <w:t xml:space="preserve"> config加入program parameter</w:t>
+      </w:pPr>
+      <w:r>
+        <w:rPr>
+          <w:rFonts w:hint="eastAsia"/>
+        </w:rPr>
+        <w:t>T</w:t>
+      </w:r>
+      <w:r>
+        <w:t>okenize openWeb dataset</w:t>
+      </w:r>
+    </w:p>
+    <w:p/>
+    <w:p/>
+    <w:p>
+      <w:pPr>
+        <w:rPr>
+          <w:b/>
+          <w:bCs/>
+          <w:color w:val="00B0F0"/>
+        </w:rPr>
+      </w:pPr>
+      <w:r>
+        <w:rPr>
+          <w:b/>
+          <w:bCs/>
+          <w:color w:val="00B0F0"/>
+        </w:rPr>
+        <w:t>Future work:</w:t>
       </w:r>
     </w:p>
     <w:p>
@@ -1450,59 +1322,14 @@
         <w:pStyle w:val="a9"/>
         <w:numPr>
           <w:ilvl w:val="0"/>
-          <w:numId w:val="13"/>
+          <w:numId w:val="14"/>
         </w:numPr>
-        <w:rPr>
-          <w:rFonts w:hint="eastAsia"/>
-        </w:rPr>
-      </w:pPr>
-      <w:r>
-        <w:rPr>
-          <w:rFonts w:hint="eastAsia"/>
-        </w:rPr>
-        <w:t>写一个</w:t>
-      </w:r>
-      <w:proofErr w:type="spellStart"/>
-      <w:r>
-        <w:rPr>
-          <w:rFonts w:hint="eastAsia"/>
-        </w:rPr>
-        <w:t>init_model_opt</w:t>
-      </w:r>
-      <w:proofErr w:type="spellEnd"/>
-      <w:r>
-        <w:rPr>
-          <w:rFonts w:hint="eastAsia"/>
-        </w:rPr>
-        <w:t>函数（接受</w:t>
-      </w:r>
-      <w:proofErr w:type="spellStart"/>
-      <w:r>
-        <w:rPr>
-          <w:rFonts w:hint="eastAsia"/>
-        </w:rPr>
-        <w:t>args.load_path</w:t>
-      </w:r>
-      <w:proofErr w:type="spellEnd"/>
-      <w:r>
-        <w:rPr>
-          <w:rFonts w:hint="eastAsia"/>
-        </w:rPr>
-        <w:t xml:space="preserve">, </w:t>
-      </w:r>
-      <w:proofErr w:type="spellStart"/>
-      <w:r>
-        <w:rPr>
-          <w:rFonts w:hint="eastAsia"/>
-        </w:rPr>
-        <w:t>args.dis_train</w:t>
-      </w:r>
-      <w:proofErr w:type="spellEnd"/>
-      <w:r>
-        <w:rPr>
-          <w:rFonts w:hint="eastAsia"/>
-        </w:rPr>
-        <w:t>）</w:t>
+      </w:pPr>
+      <w:r>
+        <w:t>Monitor the norms of activations, model weights, and gradients to make sure they are not exploding or vanishing.</w:t>
+      </w:r>
+      <w:r>
+        <w:t xml:space="preserve"> Do this on some model modifications, like remove RMSNorm, post-norm, etc.</w:t>
       </w:r>
     </w:p>
     <w:p>
@@ -1510,31 +1337,11 @@
         <w:pStyle w:val="a9"/>
         <w:numPr>
           <w:ilvl w:val="0"/>
-          <w:numId w:val="13"/>
+          <w:numId w:val="14"/>
         </w:numPr>
-        <w:rPr>
-          <w:rFonts w:hint="eastAsia"/>
-        </w:rPr>
-      </w:pPr>
-      <w:r>
-        <w:rPr>
-          <w:rFonts w:hint="eastAsia"/>
-        </w:rPr>
-        <w:t>查找学习learning rate论文，指定</w:t>
-      </w:r>
-      <w:proofErr w:type="spellStart"/>
-      <w:r>
-        <w:rPr>
-          <w:rFonts w:hint="eastAsia"/>
-        </w:rPr>
-        <w:t>lr</w:t>
-      </w:r>
-      <w:proofErr w:type="spellEnd"/>
-      <w:r>
-        <w:rPr>
-          <w:rFonts w:hint="eastAsia"/>
-        </w:rPr>
-        <w:t xml:space="preserve"> search strategy</w:t>
+      </w:pPr>
+      <w:r>
+        <w:t>Train on the openWeb dataset</w:t>
       </w:r>
     </w:p>
     <w:p>
@@ -1542,12 +1349,12 @@
         <w:pStyle w:val="a9"/>
         <w:numPr>
           <w:ilvl w:val="0"/>
-          <w:numId w:val="13"/>
+          <w:numId w:val="14"/>
         </w:numPr>
-        <w:rPr>
-          <w:rFonts w:hint="eastAsia"/>
-        </w:rPr>
-      </w:pPr>
+      </w:pPr>
+      <w:r>
+        <w:t>Make some new modification on the model architecture, in order to reduce validation loss</w:t>
+      </w:r>
     </w:p>
     <w:sectPr>
       <w:pgSz w:w="11906" w:h="16838"/>
@@ -2869,6 +2676,230 @@
       <w:pPr>
         <w:ind w:left="3960" w:hanging="440"/>
       </w:pPr>
+    </w:lvl>
+  </w:abstractNum>
+  <w:abstractNum w:abstractNumId="13" w15:restartNumberingAfterBreak="0">
+    <w:nsid w:val="7B5B1660"/>
+    <w:multiLevelType w:val="hybridMultilevel"/>
+    <w:tmpl w:val="4C98E968"/>
+    <w:lvl w:ilvl="0" w:tplc="5350A812">
+      <w:numFmt w:val="bullet"/>
+      <w:lvlText w:val="-"/>
+      <w:lvlJc w:val="left"/>
+      <w:pPr>
+        <w:ind w:left="360" w:hanging="360"/>
+      </w:pPr>
+      <w:rPr>
+        <w:rFonts w:ascii="等线" w:eastAsia="等线" w:hAnsi="等线" w:cstheme="minorBidi" w:hint="eastAsia"/>
+      </w:rPr>
+    </w:lvl>
+    <w:lvl w:ilvl="1" w:tplc="04090003" w:tentative="1">
+      <w:start w:val="1"/>
+      <w:numFmt w:val="bullet"/>
+      <w:lvlText w:val=""/>
+      <w:lvlJc w:val="left"/>
+      <w:pPr>
+        <w:ind w:left="880" w:hanging="440"/>
+      </w:pPr>
+      <w:rPr>
+        <w:rFonts w:ascii="Wingdings" w:hAnsi="Wingdings" w:hint="default"/>
+      </w:rPr>
+    </w:lvl>
+    <w:lvl w:ilvl="2" w:tplc="04090005" w:tentative="1">
+      <w:start w:val="1"/>
+      <w:numFmt w:val="bullet"/>
+      <w:lvlText w:val=""/>
+      <w:lvlJc w:val="left"/>
+      <w:pPr>
+        <w:ind w:left="1320" w:hanging="440"/>
+      </w:pPr>
+      <w:rPr>
+        <w:rFonts w:ascii="Wingdings" w:hAnsi="Wingdings" w:hint="default"/>
+      </w:rPr>
+    </w:lvl>
+    <w:lvl w:ilvl="3" w:tplc="04090001" w:tentative="1">
+      <w:start w:val="1"/>
+      <w:numFmt w:val="bullet"/>
+      <w:lvlText w:val=""/>
+      <w:lvlJc w:val="left"/>
+      <w:pPr>
+        <w:ind w:left="1760" w:hanging="440"/>
+      </w:pPr>
+      <w:rPr>
+        <w:rFonts w:ascii="Wingdings" w:hAnsi="Wingdings" w:hint="default"/>
+      </w:rPr>
+    </w:lvl>
+    <w:lvl w:ilvl="4" w:tplc="04090003" w:tentative="1">
+      <w:start w:val="1"/>
+      <w:numFmt w:val="bullet"/>
+      <w:lvlText w:val=""/>
+      <w:lvlJc w:val="left"/>
+      <w:pPr>
+        <w:ind w:left="2200" w:hanging="440"/>
+      </w:pPr>
+      <w:rPr>
+        <w:rFonts w:ascii="Wingdings" w:hAnsi="Wingdings" w:hint="default"/>
+      </w:rPr>
+    </w:lvl>
+    <w:lvl w:ilvl="5" w:tplc="04090005" w:tentative="1">
+      <w:start w:val="1"/>
+      <w:numFmt w:val="bullet"/>
+      <w:lvlText w:val=""/>
+      <w:lvlJc w:val="left"/>
+      <w:pPr>
+        <w:ind w:left="2640" w:hanging="440"/>
+      </w:pPr>
+      <w:rPr>
+        <w:rFonts w:ascii="Wingdings" w:hAnsi="Wingdings" w:hint="default"/>
+      </w:rPr>
+    </w:lvl>
+    <w:lvl w:ilvl="6" w:tplc="04090001" w:tentative="1">
+      <w:start w:val="1"/>
+      <w:numFmt w:val="bullet"/>
+      <w:lvlText w:val=""/>
+      <w:lvlJc w:val="left"/>
+      <w:pPr>
+        <w:ind w:left="3080" w:hanging="440"/>
+      </w:pPr>
+      <w:rPr>
+        <w:rFonts w:ascii="Wingdings" w:hAnsi="Wingdings" w:hint="default"/>
+      </w:rPr>
+    </w:lvl>
+    <w:lvl w:ilvl="7" w:tplc="04090003" w:tentative="1">
+      <w:start w:val="1"/>
+      <w:numFmt w:val="bullet"/>
+      <w:lvlText w:val=""/>
+      <w:lvlJc w:val="left"/>
+      <w:pPr>
+        <w:ind w:left="3520" w:hanging="440"/>
+      </w:pPr>
+      <w:rPr>
+        <w:rFonts w:ascii="Wingdings" w:hAnsi="Wingdings" w:hint="default"/>
+      </w:rPr>
+    </w:lvl>
+    <w:lvl w:ilvl="8" w:tplc="04090005" w:tentative="1">
+      <w:start w:val="1"/>
+      <w:numFmt w:val="bullet"/>
+      <w:lvlText w:val=""/>
+      <w:lvlJc w:val="left"/>
+      <w:pPr>
+        <w:ind w:left="3960" w:hanging="440"/>
+      </w:pPr>
+      <w:rPr>
+        <w:rFonts w:ascii="Wingdings" w:hAnsi="Wingdings" w:hint="default"/>
+      </w:rPr>
+    </w:lvl>
+  </w:abstractNum>
+  <w:abstractNum w:abstractNumId="14" w15:restartNumberingAfterBreak="0">
+    <w:nsid w:val="7DBB36BB"/>
+    <w:multiLevelType w:val="hybridMultilevel"/>
+    <w:tmpl w:val="01C4007C"/>
+    <w:lvl w:ilvl="0" w:tplc="F69A2C3A">
+      <w:numFmt w:val="bullet"/>
+      <w:lvlText w:val="-"/>
+      <w:lvlJc w:val="left"/>
+      <w:pPr>
+        <w:ind w:left="360" w:hanging="360"/>
+      </w:pPr>
+      <w:rPr>
+        <w:rFonts w:ascii="等线" w:eastAsia="等线" w:hAnsi="等线" w:cstheme="minorBidi" w:hint="eastAsia"/>
+      </w:rPr>
+    </w:lvl>
+    <w:lvl w:ilvl="1" w:tplc="04090003" w:tentative="1">
+      <w:start w:val="1"/>
+      <w:numFmt w:val="bullet"/>
+      <w:lvlText w:val=""/>
+      <w:lvlJc w:val="left"/>
+      <w:pPr>
+        <w:ind w:left="880" w:hanging="440"/>
+      </w:pPr>
+      <w:rPr>
+        <w:rFonts w:ascii="Wingdings" w:hAnsi="Wingdings" w:hint="default"/>
+      </w:rPr>
+    </w:lvl>
+    <w:lvl w:ilvl="2" w:tplc="04090005" w:tentative="1">
+      <w:start w:val="1"/>
+      <w:numFmt w:val="bullet"/>
+      <w:lvlText w:val=""/>
+      <w:lvlJc w:val="left"/>
+      <w:pPr>
+        <w:ind w:left="1320" w:hanging="440"/>
+      </w:pPr>
+      <w:rPr>
+        <w:rFonts w:ascii="Wingdings" w:hAnsi="Wingdings" w:hint="default"/>
+      </w:rPr>
+    </w:lvl>
+    <w:lvl w:ilvl="3" w:tplc="04090001" w:tentative="1">
+      <w:start w:val="1"/>
+      <w:numFmt w:val="bullet"/>
+      <w:lvlText w:val=""/>
+      <w:lvlJc w:val="left"/>
+      <w:pPr>
+        <w:ind w:left="1760" w:hanging="440"/>
+      </w:pPr>
+      <w:rPr>
+        <w:rFonts w:ascii="Wingdings" w:hAnsi="Wingdings" w:hint="default"/>
+      </w:rPr>
+    </w:lvl>
+    <w:lvl w:ilvl="4" w:tplc="04090003" w:tentative="1">
+      <w:start w:val="1"/>
+      <w:numFmt w:val="bullet"/>
+      <w:lvlText w:val=""/>
+      <w:lvlJc w:val="left"/>
+      <w:pPr>
+        <w:ind w:left="2200" w:hanging="440"/>
+      </w:pPr>
+      <w:rPr>
+        <w:rFonts w:ascii="Wingdings" w:hAnsi="Wingdings" w:hint="default"/>
+      </w:rPr>
+    </w:lvl>
+    <w:lvl w:ilvl="5" w:tplc="04090005" w:tentative="1">
+      <w:start w:val="1"/>
+      <w:numFmt w:val="bullet"/>
+      <w:lvlText w:val=""/>
+      <w:lvlJc w:val="left"/>
+      <w:pPr>
+        <w:ind w:left="2640" w:hanging="440"/>
+      </w:pPr>
+      <w:rPr>
+        <w:rFonts w:ascii="Wingdings" w:hAnsi="Wingdings" w:hint="default"/>
+      </w:rPr>
+    </w:lvl>
+    <w:lvl w:ilvl="6" w:tplc="04090001" w:tentative="1">
+      <w:start w:val="1"/>
+      <w:numFmt w:val="bullet"/>
+      <w:lvlText w:val=""/>
+      <w:lvlJc w:val="left"/>
+      <w:pPr>
+        <w:ind w:left="3080" w:hanging="440"/>
+      </w:pPr>
+      <w:rPr>
+        <w:rFonts w:ascii="Wingdings" w:hAnsi="Wingdings" w:hint="default"/>
+      </w:rPr>
+    </w:lvl>
+    <w:lvl w:ilvl="7" w:tplc="04090003" w:tentative="1">
+      <w:start w:val="1"/>
+      <w:numFmt w:val="bullet"/>
+      <w:lvlText w:val=""/>
+      <w:lvlJc w:val="left"/>
+      <w:pPr>
+        <w:ind w:left="3520" w:hanging="440"/>
+      </w:pPr>
+      <w:rPr>
+        <w:rFonts w:ascii="Wingdings" w:hAnsi="Wingdings" w:hint="default"/>
+      </w:rPr>
+    </w:lvl>
+    <w:lvl w:ilvl="8" w:tplc="04090005" w:tentative="1">
+      <w:start w:val="1"/>
+      <w:numFmt w:val="bullet"/>
+      <w:lvlText w:val=""/>
+      <w:lvlJc w:val="left"/>
+      <w:pPr>
+        <w:ind w:left="3960" w:hanging="440"/>
+      </w:pPr>
+      <w:rPr>
+        <w:rFonts w:ascii="Wingdings" w:hAnsi="Wingdings" w:hint="default"/>
+      </w:rPr>
     </w:lvl>
   </w:abstractNum>
   <w:num w:numId="1" w16cid:durableId="78212391">
@@ -2909,6 +2940,12 @@
   </w:num>
   <w:num w:numId="13" w16cid:durableId="1261572405">
     <w:abstractNumId w:val="7"/>
+  </w:num>
+  <w:num w:numId="14" w16cid:durableId="1710837745">
+    <w:abstractNumId w:val="13"/>
+  </w:num>
+  <w:num w:numId="15" w16cid:durableId="1684283673">
+    <w:abstractNumId w:val="14"/>
   </w:num>
 </w:numbering>
 </file>
@@ -3515,7 +3552,6 @@
   <w:style w:type="character" w:default="1" w:styleId="a0">
     <w:name w:val="Default Paragraph Font"/>
     <w:uiPriority w:val="1"/>
-    <w:semiHidden/>
     <w:unhideWhenUsed/>
   </w:style>
   <w:style w:type="table" w:default="1" w:styleId="a1">

</xml_diff>

<commit_message>
add serialization and timing to BPE trainer
</commit_message>
<xml_diff>
--- a/作业记录.docx
+++ b/作业记录.docx
@@ -27,27 +27,26 @@
           <w:ilvl w:val="0"/>
           <w:numId w:val="1"/>
         </w:numPr>
-        <w:rPr>
-          <w:rFonts w:hint="eastAsia"/>
-        </w:rPr>
-      </w:pPr>
-      <w:r>
-        <w:rPr>
-          <w:rFonts w:hint="eastAsia"/>
-        </w:rPr>
-        <w:t xml:space="preserve">手写了transformer LM：Linear, Embedding, MHA, </w:t>
-      </w:r>
-      <w:r>
-        <w:rPr>
-          <w:rFonts w:hint="eastAsia"/>
-        </w:rPr>
-        <w:t xml:space="preserve">RoPE, </w:t>
-      </w:r>
-      <w:r>
-        <w:rPr>
-          <w:rFonts w:hint="eastAsia"/>
-        </w:rPr>
-        <w:t>SwiGLU, etc.</w:t>
+      </w:pPr>
+      <w:r>
+        <w:rPr>
+          <w:rFonts w:hint="eastAsia"/>
+        </w:rPr>
+        <w:t xml:space="preserve">手写了BPE tokenizer的训练代码，在2.07 Tiny </w:t>
+      </w:r>
+      <w:proofErr w:type="spellStart"/>
+      <w:r>
+        <w:rPr>
+          <w:rFonts w:hint="eastAsia"/>
+        </w:rPr>
+        <w:t>Storiess</w:t>
+      </w:r>
+      <w:proofErr w:type="spellEnd"/>
+      <w:r>
+        <w:rPr>
+          <w:rFonts w:hint="eastAsia"/>
+        </w:rPr>
+        <w:t xml:space="preserve">数据集上训练，GPU占用&lt;, 时间&lt; </w:t>
       </w:r>
     </w:p>
     <w:p>
@@ -65,47 +64,35 @@
         <w:rPr>
           <w:rFonts w:hint="eastAsia"/>
         </w:rPr>
-        <w:t>估算了model的memory size（</w:t>
-      </w:r>
-      <w:r>
-        <w:rPr>
-          <w:rFonts w:hint="eastAsia"/>
-          <w:u w:val="single"/>
-        </w:rPr>
-        <w:t>手工计算</w:t>
-      </w:r>
-      <w:r>
-        <w:rPr>
-          <w:rFonts w:hint="eastAsia"/>
-          <w:u w:val="single"/>
-        </w:rPr>
-        <w:t>：</w:t>
-      </w:r>
-      <w:r>
-        <w:rPr>
-          <w:rFonts w:hint="eastAsia"/>
-        </w:rPr>
-        <w:t>每个模块单独计算，根据model config；</w:t>
-      </w:r>
-      <w:r>
-        <w:rPr>
-          <w:rFonts w:hint="eastAsia"/>
-          <w:u w:val="single"/>
-        </w:rPr>
-        <w:t>代码计算</w:t>
-      </w:r>
-      <w:r>
-        <w:rPr>
-          <w:rFonts w:hint="eastAsia"/>
-          <w:u w:val="single"/>
-        </w:rPr>
-        <w:t>：</w:t>
-      </w:r>
-      <w:r>
-        <w:rPr>
-          <w:rFonts w:hint="eastAsia"/>
-        </w:rPr>
-        <w:t>分别计算parameters（），buffers（））</w:t>
+        <w:t xml:space="preserve">手写了transformer LM：Linear, Embedding, MHA, </w:t>
+      </w:r>
+      <w:proofErr w:type="spellStart"/>
+      <w:r>
+        <w:rPr>
+          <w:rFonts w:hint="eastAsia"/>
+        </w:rPr>
+        <w:t>RoPE</w:t>
+      </w:r>
+      <w:proofErr w:type="spellEnd"/>
+      <w:r>
+        <w:rPr>
+          <w:rFonts w:hint="eastAsia"/>
+        </w:rPr>
+        <w:t xml:space="preserve">, </w:t>
+      </w:r>
+      <w:proofErr w:type="spellStart"/>
+      <w:r>
+        <w:rPr>
+          <w:rFonts w:hint="eastAsia"/>
+        </w:rPr>
+        <w:t>SwiGLU</w:t>
+      </w:r>
+      <w:proofErr w:type="spellEnd"/>
+      <w:r>
+        <w:rPr>
+          <w:rFonts w:hint="eastAsia"/>
+        </w:rPr>
+        <w:t>, etc.</w:t>
       </w:r>
     </w:p>
     <w:p>
@@ -123,13 +110,47 @@
         <w:rPr>
           <w:rFonts w:hint="eastAsia"/>
         </w:rPr>
-        <w:t>估算了model的FLOPs运算量（每个模块单独计算：可分为Linear层和Attention层）</w:t>
-      </w:r>
-      <w:r>
-        <w:rPr>
-          <w:rFonts w:hint="eastAsia"/>
-        </w:rPr>
-        <w:t>，计算了不同模块的FLOPs占比，以及占比随model size的变化</w:t>
+        <w:t>估算了model的memory size（</w:t>
+      </w:r>
+      <w:r>
+        <w:rPr>
+          <w:rFonts w:hint="eastAsia"/>
+          <w:u w:val="single"/>
+        </w:rPr>
+        <w:t>手工计算</w:t>
+      </w:r>
+      <w:r>
+        <w:rPr>
+          <w:rFonts w:hint="eastAsia"/>
+          <w:u w:val="single"/>
+        </w:rPr>
+        <w:t>：</w:t>
+      </w:r>
+      <w:r>
+        <w:rPr>
+          <w:rFonts w:hint="eastAsia"/>
+        </w:rPr>
+        <w:t>每个模块单独计算，根据model config；</w:t>
+      </w:r>
+      <w:r>
+        <w:rPr>
+          <w:rFonts w:hint="eastAsia"/>
+          <w:u w:val="single"/>
+        </w:rPr>
+        <w:t>代码计算</w:t>
+      </w:r>
+      <w:r>
+        <w:rPr>
+          <w:rFonts w:hint="eastAsia"/>
+          <w:u w:val="single"/>
+        </w:rPr>
+        <w:t>：</w:t>
+      </w:r>
+      <w:r>
+        <w:rPr>
+          <w:rFonts w:hint="eastAsia"/>
+        </w:rPr>
+        <w:t>分别计算parameters（），buffers（））</w:t>
       </w:r>
     </w:p>
     <w:p>
@@ -147,25 +168,13 @@
         <w:rPr>
           <w:rFonts w:hint="eastAsia"/>
         </w:rPr>
-        <w:t>手写了AdamW optimizer</w:t>
-      </w:r>
-      <w:r>
-        <w:rPr>
-          <w:rFonts w:hint="eastAsia"/>
-        </w:rPr>
-        <w:t>。</w:t>
-      </w:r>
-      <w:r>
-        <w:rPr>
-          <w:rFonts w:hint="eastAsia"/>
-        </w:rPr>
-        <w:t>估算了model训练时的peak memeory</w:t>
-      </w:r>
-      <w:r>
-        <w:rPr>
-          <w:rFonts w:hint="eastAsia"/>
-        </w:rPr>
-        <w:t>以及FLOPs。</w:t>
+        <w:t>估算了model的FLOPs运算量（每个模块单独计算：可分为Linear层和Attention层）</w:t>
+      </w:r>
+      <w:r>
+        <w:rPr>
+          <w:rFonts w:hint="eastAsia"/>
+        </w:rPr>
+        <w:t>，计算了不同模块的FLOPs占比，以及占比随model size的变化</w:t>
       </w:r>
     </w:p>
     <w:p>
@@ -183,6 +192,64 @@
         <w:rPr>
           <w:rFonts w:hint="eastAsia"/>
         </w:rPr>
+        <w:t>手写了</w:t>
+      </w:r>
+      <w:proofErr w:type="spellStart"/>
+      <w:r>
+        <w:rPr>
+          <w:rFonts w:hint="eastAsia"/>
+        </w:rPr>
+        <w:t>AdamW</w:t>
+      </w:r>
+      <w:proofErr w:type="spellEnd"/>
+      <w:r>
+        <w:rPr>
+          <w:rFonts w:hint="eastAsia"/>
+        </w:rPr>
+        <w:t xml:space="preserve"> optimizer</w:t>
+      </w:r>
+      <w:r>
+        <w:rPr>
+          <w:rFonts w:hint="eastAsia"/>
+        </w:rPr>
+        <w:t>。</w:t>
+      </w:r>
+      <w:r>
+        <w:rPr>
+          <w:rFonts w:hint="eastAsia"/>
+        </w:rPr>
+        <w:t xml:space="preserve">估算了model训练时的peak </w:t>
+      </w:r>
+      <w:proofErr w:type="spellStart"/>
+      <w:r>
+        <w:rPr>
+          <w:rFonts w:hint="eastAsia"/>
+        </w:rPr>
+        <w:t>memeory</w:t>
+      </w:r>
+      <w:proofErr w:type="spellEnd"/>
+      <w:r>
+        <w:rPr>
+          <w:rFonts w:hint="eastAsia"/>
+        </w:rPr>
+        <w:t>以及FLOPs。</w:t>
+      </w:r>
+    </w:p>
+    <w:p>
+      <w:pPr>
+        <w:pStyle w:val="a9"/>
+        <w:numPr>
+          <w:ilvl w:val="0"/>
+          <w:numId w:val="1"/>
+        </w:numPr>
+        <w:rPr>
+          <w:rFonts w:hint="eastAsia"/>
+        </w:rPr>
+      </w:pPr>
+      <w:r>
+        <w:rPr>
+          <w:rFonts w:hint="eastAsia"/>
+        </w:rPr>
         <w:t>编写了model的训练代码</w:t>
       </w:r>
     </w:p>
@@ -204,18 +271,75 @@
     <w:p>
       <w:pPr>
         <w:rPr>
-          <w:rFonts w:hint="eastAsia"/>
           <w:b/>
           <w:bCs/>
         </w:rPr>
       </w:pPr>
       <w:r>
         <w:rPr>
-          <w:rFonts w:hint="eastAsia"/>
           <w:b/>
           <w:bCs/>
         </w:rPr>
         <w:lastRenderedPageBreak/>
+        <w:t>BPE Trainer:</w:t>
+      </w:r>
+    </w:p>
+    <w:p/>
+    <w:p>
+      <w:pPr>
+        <w:pStyle w:val="a9"/>
+        <w:numPr>
+          <w:ilvl w:val="0"/>
+          <w:numId w:val="16"/>
+        </w:numPr>
+      </w:pPr>
+      <w:r>
+        <w:rPr>
+          <w:rFonts w:hint="eastAsia"/>
+        </w:rPr>
+        <w:t>各个模块测试时间，（在tiny stories数据集上）其中pre-tokenization 时间&lt; 2 min</w:t>
+      </w:r>
+    </w:p>
+    <w:p>
+      <w:pPr>
+        <w:pStyle w:val="a9"/>
+        <w:numPr>
+          <w:ilvl w:val="0"/>
+          <w:numId w:val="16"/>
+        </w:numPr>
+        <w:rPr>
+          <w:rFonts w:hint="eastAsia"/>
+        </w:rPr>
+      </w:pPr>
+      <w:r>
+        <w:rPr>
+          <w:rFonts w:hint="eastAsia"/>
+        </w:rPr>
+        <w:t>存储vocab和merges</w:t>
+      </w:r>
+    </w:p>
+    <w:p>
+      <w:pPr>
+        <w:rPr>
+          <w:b/>
+          <w:bCs/>
+        </w:rPr>
+      </w:pPr>
+    </w:p>
+    <w:p>
+      <w:pPr>
+        <w:rPr>
+          <w:rFonts w:hint="eastAsia"/>
+          <w:b/>
+          <w:bCs/>
+        </w:rPr>
+      </w:pPr>
+      <w:r>
+        <w:rPr>
+          <w:rFonts w:hint="eastAsia"/>
+          <w:b/>
+          <w:bCs/>
+        </w:rPr>
         <w:t>训练：</w:t>
       </w:r>
     </w:p>
@@ -260,7 +384,23 @@
           <w:rFonts w:hint="eastAsia"/>
           <w:color w:val="00B0F0"/>
         </w:rPr>
-        <w:t>Load data使用自定义stride，而不是context_length + 1</w:t>
+        <w:t>Load data使用自定义stride，而不是</w:t>
+      </w:r>
+      <w:proofErr w:type="spellStart"/>
+      <w:r>
+        <w:rPr>
+          <w:rFonts w:hint="eastAsia"/>
+          <w:color w:val="00B0F0"/>
+        </w:rPr>
+        <w:t>context_length</w:t>
+      </w:r>
+      <w:proofErr w:type="spellEnd"/>
+      <w:r>
+        <w:rPr>
+          <w:rFonts w:hint="eastAsia"/>
+          <w:color w:val="00B0F0"/>
+        </w:rPr>
+        <w:t xml:space="preserve"> + 1</w:t>
       </w:r>
     </w:p>
     <w:p>
@@ -397,8 +537,17 @@
           <w:rFonts w:hint="eastAsia"/>
           <w:color w:val="000000" w:themeColor="text1"/>
         </w:rPr>
-        <w:t>Jit编译：torch.compile</w:t>
-      </w:r>
+        <w:t>Jit编译：</w:t>
+      </w:r>
+      <w:proofErr w:type="spellStart"/>
+      <w:r>
+        <w:rPr>
+          <w:rFonts w:hint="eastAsia"/>
+          <w:color w:val="000000" w:themeColor="text1"/>
+        </w:rPr>
+        <w:t>torch.compile</w:t>
+      </w:r>
+      <w:proofErr w:type="spellEnd"/>
       <w:r>
         <w:rPr>
           <w:rFonts w:hint="eastAsia"/>
@@ -466,11 +615,19 @@
         </w:rPr>
         <w:t xml:space="preserve">validation loss, </w:t>
       </w:r>
-      <w:r>
-        <w:rPr>
-          <w:rFonts w:hint="eastAsia"/>
-        </w:rPr>
-        <w:t>lr, time</w:t>
+      <w:proofErr w:type="spellStart"/>
+      <w:r>
+        <w:rPr>
+          <w:rFonts w:hint="eastAsia"/>
+        </w:rPr>
+        <w:t>lr</w:t>
+      </w:r>
+      <w:proofErr w:type="spellEnd"/>
+      <w:r>
+        <w:rPr>
+          <w:rFonts w:hint="eastAsia"/>
+        </w:rPr>
+        <w:t>, time</w:t>
       </w:r>
     </w:p>
     <w:p>
@@ -487,8 +644,17 @@
           <w:rFonts w:hint="eastAsia"/>
           <w:u w:val="single"/>
         </w:rPr>
-        <w:t>工具：wandb</w:t>
-      </w:r>
+        <w:t>工具：</w:t>
+      </w:r>
+      <w:proofErr w:type="spellStart"/>
+      <w:r>
+        <w:rPr>
+          <w:rFonts w:hint="eastAsia"/>
+          <w:u w:val="single"/>
+        </w:rPr>
+        <w:t>wandb</w:t>
+      </w:r>
+      <w:proofErr w:type="spellEnd"/>
     </w:p>
     <w:p>
       <w:pPr>
@@ -551,7 +717,23 @@
           <w:rFonts w:hint="eastAsia"/>
           <w:color w:val="00B0F0"/>
         </w:rPr>
-        <w:t>保存/恢复dataloader checkpoint</w:t>
+        <w:t>保存/恢复</w:t>
+      </w:r>
+      <w:proofErr w:type="spellStart"/>
+      <w:r>
+        <w:rPr>
+          <w:rFonts w:hint="eastAsia"/>
+          <w:color w:val="00B0F0"/>
+        </w:rPr>
+        <w:t>dataloader</w:t>
+      </w:r>
+      <w:proofErr w:type="spellEnd"/>
+      <w:r>
+        <w:rPr>
+          <w:rFonts w:hint="eastAsia"/>
+          <w:color w:val="00B0F0"/>
+        </w:rPr>
+        <w:t xml:space="preserve"> checkpoint</w:t>
       </w:r>
       <w:r>
         <w:rPr>
@@ -605,11 +787,19 @@
           <w:rFonts w:hint="eastAsia"/>
         </w:rPr>
       </w:pPr>
-      <w:r>
-        <w:rPr>
-          <w:rFonts w:hint="eastAsia"/>
-        </w:rPr>
-        <w:t>Softmax with temperature scaling</w:t>
+      <w:proofErr w:type="spellStart"/>
+      <w:r>
+        <w:rPr>
+          <w:rFonts w:hint="eastAsia"/>
+        </w:rPr>
+        <w:t>Softmax</w:t>
+      </w:r>
+      <w:proofErr w:type="spellEnd"/>
+      <w:r>
+        <w:rPr>
+          <w:rFonts w:hint="eastAsia"/>
+        </w:rPr>
+        <w:t xml:space="preserve"> with temperature scaling</w:t>
       </w:r>
     </w:p>
     <w:p>
@@ -945,6 +1135,7 @@
           <w:rFonts w:hint="eastAsia"/>
           <w:lang w:val="fr-FR"/>
         </w:rPr>
+        <w:lastRenderedPageBreak/>
         <w:t>设置模块：model, data</w:t>
       </w:r>
     </w:p>
@@ -1083,11 +1274,33 @@
           <w:rFonts w:hint="eastAsia"/>
         </w:rPr>
       </w:pPr>
-      <w:r>
-        <w:rPr>
-          <w:rFonts w:hint="eastAsia"/>
-        </w:rPr>
-        <w:t>Dataloader：drop_last = Tr</w:t>
+      <w:proofErr w:type="spellStart"/>
+      <w:r>
+        <w:rPr>
+          <w:rFonts w:hint="eastAsia"/>
+        </w:rPr>
+        <w:t>Dataloader</w:t>
+      </w:r>
+      <w:proofErr w:type="spellEnd"/>
+      <w:r>
+        <w:rPr>
+          <w:rFonts w:hint="eastAsia"/>
+        </w:rPr>
+        <w:t>：</w:t>
+      </w:r>
+      <w:proofErr w:type="spellStart"/>
+      <w:r>
+        <w:rPr>
+          <w:rFonts w:hint="eastAsia"/>
+        </w:rPr>
+        <w:t>drop_last</w:t>
+      </w:r>
+      <w:proofErr w:type="spellEnd"/>
+      <w:r>
+        <w:rPr>
+          <w:rFonts w:hint="eastAsia"/>
+        </w:rPr>
+        <w:t xml:space="preserve"> = Tr</w:t>
       </w:r>
       <w:r>
         <w:rPr>
@@ -1238,6 +1451,7 @@
     <w:p>
       <w:pPr>
         <w:rPr>
+          <w:rFonts w:hint="eastAsia"/>
           <w:b/>
           <w:bCs/>
         </w:rPr>
@@ -1271,13 +1485,23 @@
           <w:bCs/>
         </w:rPr>
       </w:pPr>
+      <w:proofErr w:type="spellStart"/>
       <w:r>
         <w:rPr>
           <w:rFonts w:hint="eastAsia"/>
           <w:b/>
           <w:bCs/>
         </w:rPr>
-        <w:t>Silu测试</w:t>
+        <w:t>Silu</w:t>
+      </w:r>
+      <w:proofErr w:type="spellEnd"/>
+      <w:r>
+        <w:rPr>
+          <w:rFonts w:hint="eastAsia"/>
+          <w:b/>
+          <w:bCs/>
+        </w:rPr>
+        <w:t>测试</w:t>
       </w:r>
     </w:p>
     <w:p>
@@ -1287,6 +1511,9 @@
           <w:ilvl w:val="0"/>
           <w:numId w:val="15"/>
         </w:numPr>
+        <w:rPr>
+          <w:rFonts w:hint="eastAsia"/>
+        </w:rPr>
       </w:pPr>
       <w:r>
         <w:rPr>
@@ -1295,14 +1522,35 @@
         <w:t>T</w:t>
       </w:r>
       <w:r>
-        <w:t>okenize openWeb dataset</w:t>
-      </w:r>
-    </w:p>
-    <w:p/>
-    <w:p/>
-    <w:p>
-      <w:pPr>
-        <w:rPr>
+        <w:t xml:space="preserve">okenize </w:t>
+      </w:r>
+      <w:proofErr w:type="spellStart"/>
+      <w:r>
+        <w:t>openWeb</w:t>
+      </w:r>
+      <w:proofErr w:type="spellEnd"/>
+      <w:r>
+        <w:t xml:space="preserve"> dataset</w:t>
+      </w:r>
+    </w:p>
+    <w:p>
+      <w:pPr>
+        <w:rPr>
+          <w:rFonts w:hint="eastAsia"/>
+        </w:rPr>
+      </w:pPr>
+    </w:p>
+    <w:p>
+      <w:pPr>
+        <w:rPr>
+          <w:rFonts w:hint="eastAsia"/>
+        </w:rPr>
+      </w:pPr>
+    </w:p>
+    <w:p>
+      <w:pPr>
+        <w:rPr>
+          <w:rFonts w:hint="eastAsia"/>
           <w:b/>
           <w:bCs/>
           <w:color w:val="00B0F0"/>
@@ -1324,12 +1572,23 @@
           <w:ilvl w:val="0"/>
           <w:numId w:val="14"/>
         </w:numPr>
+        <w:rPr>
+          <w:rFonts w:hint="eastAsia"/>
+        </w:rPr>
       </w:pPr>
       <w:r>
         <w:t>Monitor the norms of activations, model weights, and gradients to make sure they are not exploding or vanishing.</w:t>
       </w:r>
       <w:r>
-        <w:t xml:space="preserve"> Do this on some model modifications, like remove RMSNorm, post-norm, etc.</w:t>
+        <w:t xml:space="preserve"> Do this on some model modifications, like remove </w:t>
+      </w:r>
+      <w:proofErr w:type="spellStart"/>
+      <w:r>
+        <w:t>RMSNorm</w:t>
+      </w:r>
+      <w:proofErr w:type="spellEnd"/>
+      <w:r>
+        <w:t>, post-norm, etc.</w:t>
       </w:r>
     </w:p>
     <w:p>
@@ -1339,9 +1598,20 @@
           <w:ilvl w:val="0"/>
           <w:numId w:val="14"/>
         </w:numPr>
-      </w:pPr>
-      <w:r>
-        <w:t>Train on the openWeb dataset</w:t>
+        <w:rPr>
+          <w:rFonts w:hint="eastAsia"/>
+        </w:rPr>
+      </w:pPr>
+      <w:r>
+        <w:t xml:space="preserve">Train on the </w:t>
+      </w:r>
+      <w:proofErr w:type="spellStart"/>
+      <w:r>
+        <w:t>openWeb</w:t>
+      </w:r>
+      <w:proofErr w:type="spellEnd"/>
+      <w:r>
+        <w:t xml:space="preserve"> dataset</w:t>
       </w:r>
     </w:p>
     <w:p>
@@ -1351,6 +1621,9 @@
           <w:ilvl w:val="0"/>
           <w:numId w:val="14"/>
         </w:numPr>
+        <w:rPr>
+          <w:rFonts w:hint="eastAsia"/>
+        </w:rPr>
       </w:pPr>
       <w:r>
         <w:t>Make some new modification on the model architecture, in order to reduce validation loss</w:t>
@@ -1985,6 +2258,118 @@
     </w:lvl>
   </w:abstractNum>
   <w:abstractNum w:abstractNumId="6" w15:restartNumberingAfterBreak="0">
+    <w:nsid w:val="3D8B4E2F"/>
+    <w:multiLevelType w:val="hybridMultilevel"/>
+    <w:tmpl w:val="9AAC560C"/>
+    <w:lvl w:ilvl="0" w:tplc="A7B67B52">
+      <w:numFmt w:val="bullet"/>
+      <w:lvlText w:val="-"/>
+      <w:lvlJc w:val="left"/>
+      <w:pPr>
+        <w:ind w:left="360" w:hanging="360"/>
+      </w:pPr>
+      <w:rPr>
+        <w:rFonts w:ascii="等线" w:eastAsia="等线" w:hAnsi="等线" w:cstheme="minorBidi" w:hint="eastAsia"/>
+      </w:rPr>
+    </w:lvl>
+    <w:lvl w:ilvl="1" w:tplc="04090003" w:tentative="1">
+      <w:start w:val="1"/>
+      <w:numFmt w:val="bullet"/>
+      <w:lvlText w:val=""/>
+      <w:lvlJc w:val="left"/>
+      <w:pPr>
+        <w:ind w:left="880" w:hanging="440"/>
+      </w:pPr>
+      <w:rPr>
+        <w:rFonts w:ascii="Wingdings" w:hAnsi="Wingdings" w:hint="default"/>
+      </w:rPr>
+    </w:lvl>
+    <w:lvl w:ilvl="2" w:tplc="04090005" w:tentative="1">
+      <w:start w:val="1"/>
+      <w:numFmt w:val="bullet"/>
+      <w:lvlText w:val=""/>
+      <w:lvlJc w:val="left"/>
+      <w:pPr>
+        <w:ind w:left="1320" w:hanging="440"/>
+      </w:pPr>
+      <w:rPr>
+        <w:rFonts w:ascii="Wingdings" w:hAnsi="Wingdings" w:hint="default"/>
+      </w:rPr>
+    </w:lvl>
+    <w:lvl w:ilvl="3" w:tplc="04090001" w:tentative="1">
+      <w:start w:val="1"/>
+      <w:numFmt w:val="bullet"/>
+      <w:lvlText w:val=""/>
+      <w:lvlJc w:val="left"/>
+      <w:pPr>
+        <w:ind w:left="1760" w:hanging="440"/>
+      </w:pPr>
+      <w:rPr>
+        <w:rFonts w:ascii="Wingdings" w:hAnsi="Wingdings" w:hint="default"/>
+      </w:rPr>
+    </w:lvl>
+    <w:lvl w:ilvl="4" w:tplc="04090003" w:tentative="1">
+      <w:start w:val="1"/>
+      <w:numFmt w:val="bullet"/>
+      <w:lvlText w:val=""/>
+      <w:lvlJc w:val="left"/>
+      <w:pPr>
+        <w:ind w:left="2200" w:hanging="440"/>
+      </w:pPr>
+      <w:rPr>
+        <w:rFonts w:ascii="Wingdings" w:hAnsi="Wingdings" w:hint="default"/>
+      </w:rPr>
+    </w:lvl>
+    <w:lvl w:ilvl="5" w:tplc="04090005" w:tentative="1">
+      <w:start w:val="1"/>
+      <w:numFmt w:val="bullet"/>
+      <w:lvlText w:val=""/>
+      <w:lvlJc w:val="left"/>
+      <w:pPr>
+        <w:ind w:left="2640" w:hanging="440"/>
+      </w:pPr>
+      <w:rPr>
+        <w:rFonts w:ascii="Wingdings" w:hAnsi="Wingdings" w:hint="default"/>
+      </w:rPr>
+    </w:lvl>
+    <w:lvl w:ilvl="6" w:tplc="04090001" w:tentative="1">
+      <w:start w:val="1"/>
+      <w:numFmt w:val="bullet"/>
+      <w:lvlText w:val=""/>
+      <w:lvlJc w:val="left"/>
+      <w:pPr>
+        <w:ind w:left="3080" w:hanging="440"/>
+      </w:pPr>
+      <w:rPr>
+        <w:rFonts w:ascii="Wingdings" w:hAnsi="Wingdings" w:hint="default"/>
+      </w:rPr>
+    </w:lvl>
+    <w:lvl w:ilvl="7" w:tplc="04090003" w:tentative="1">
+      <w:start w:val="1"/>
+      <w:numFmt w:val="bullet"/>
+      <w:lvlText w:val=""/>
+      <w:lvlJc w:val="left"/>
+      <w:pPr>
+        <w:ind w:left="3520" w:hanging="440"/>
+      </w:pPr>
+      <w:rPr>
+        <w:rFonts w:ascii="Wingdings" w:hAnsi="Wingdings" w:hint="default"/>
+      </w:rPr>
+    </w:lvl>
+    <w:lvl w:ilvl="8" w:tplc="04090005" w:tentative="1">
+      <w:start w:val="1"/>
+      <w:numFmt w:val="bullet"/>
+      <w:lvlText w:val=""/>
+      <w:lvlJc w:val="left"/>
+      <w:pPr>
+        <w:ind w:left="3960" w:hanging="440"/>
+      </w:pPr>
+      <w:rPr>
+        <w:rFonts w:ascii="Wingdings" w:hAnsi="Wingdings" w:hint="default"/>
+      </w:rPr>
+    </w:lvl>
+  </w:abstractNum>
+  <w:abstractNum w:abstractNumId="7" w15:restartNumberingAfterBreak="0">
     <w:nsid w:val="4405269E"/>
     <w:multiLevelType w:val="hybridMultilevel"/>
     <w:tmpl w:val="072CA276"/>
@@ -2097,7 +2482,7 @@
       </w:rPr>
     </w:lvl>
   </w:abstractNum>
-  <w:abstractNum w:abstractNumId="7" w15:restartNumberingAfterBreak="0">
+  <w:abstractNum w:abstractNumId="8" w15:restartNumberingAfterBreak="0">
     <w:nsid w:val="478163C3"/>
     <w:multiLevelType w:val="hybridMultilevel"/>
     <w:tmpl w:val="2BF26300"/>
@@ -2209,7 +2594,7 @@
       </w:rPr>
     </w:lvl>
   </w:abstractNum>
-  <w:abstractNum w:abstractNumId="8" w15:restartNumberingAfterBreak="0">
+  <w:abstractNum w:abstractNumId="9" w15:restartNumberingAfterBreak="0">
     <w:nsid w:val="47AA1B63"/>
     <w:multiLevelType w:val="hybridMultilevel"/>
     <w:tmpl w:val="505664DA"/>
@@ -2298,7 +2683,7 @@
       </w:pPr>
     </w:lvl>
   </w:abstractNum>
-  <w:abstractNum w:abstractNumId="9" w15:restartNumberingAfterBreak="0">
+  <w:abstractNum w:abstractNumId="10" w15:restartNumberingAfterBreak="0">
     <w:nsid w:val="5B9B1623"/>
     <w:multiLevelType w:val="hybridMultilevel"/>
     <w:tmpl w:val="E76CACAE"/>
@@ -2387,7 +2772,7 @@
       </w:pPr>
     </w:lvl>
   </w:abstractNum>
-  <w:abstractNum w:abstractNumId="10" w15:restartNumberingAfterBreak="0">
+  <w:abstractNum w:abstractNumId="11" w15:restartNumberingAfterBreak="0">
     <w:nsid w:val="62B172BF"/>
     <w:multiLevelType w:val="hybridMultilevel"/>
     <w:tmpl w:val="1D66575A"/>
@@ -2500,7 +2885,7 @@
       </w:rPr>
     </w:lvl>
   </w:abstractNum>
-  <w:abstractNum w:abstractNumId="11" w15:restartNumberingAfterBreak="0">
+  <w:abstractNum w:abstractNumId="12" w15:restartNumberingAfterBreak="0">
     <w:nsid w:val="643F0A79"/>
     <w:multiLevelType w:val="hybridMultilevel"/>
     <w:tmpl w:val="07BE7228"/>
@@ -2589,7 +2974,7 @@
       </w:pPr>
     </w:lvl>
   </w:abstractNum>
-  <w:abstractNum w:abstractNumId="12" w15:restartNumberingAfterBreak="0">
+  <w:abstractNum w:abstractNumId="13" w15:restartNumberingAfterBreak="0">
     <w:nsid w:val="69536321"/>
     <w:multiLevelType w:val="hybridMultilevel"/>
     <w:tmpl w:val="6128D462"/>
@@ -2678,7 +3063,7 @@
       </w:pPr>
     </w:lvl>
   </w:abstractNum>
-  <w:abstractNum w:abstractNumId="13" w15:restartNumberingAfterBreak="0">
+  <w:abstractNum w:abstractNumId="14" w15:restartNumberingAfterBreak="0">
     <w:nsid w:val="7B5B1660"/>
     <w:multiLevelType w:val="hybridMultilevel"/>
     <w:tmpl w:val="4C98E968"/>
@@ -2790,7 +3175,7 @@
       </w:rPr>
     </w:lvl>
   </w:abstractNum>
-  <w:abstractNum w:abstractNumId="14" w15:restartNumberingAfterBreak="0">
+  <w:abstractNum w:abstractNumId="15" w15:restartNumberingAfterBreak="0">
     <w:nsid w:val="7DBB36BB"/>
     <w:multiLevelType w:val="hybridMultilevel"/>
     <w:tmpl w:val="01C4007C"/>
@@ -2906,22 +3291,22 @@
     <w:abstractNumId w:val="0"/>
   </w:num>
   <w:num w:numId="2" w16cid:durableId="1578438118">
-    <w:abstractNumId w:val="11"/>
+    <w:abstractNumId w:val="12"/>
   </w:num>
   <w:num w:numId="3" w16cid:durableId="867763447">
-    <w:abstractNumId w:val="6"/>
+    <w:abstractNumId w:val="7"/>
   </w:num>
   <w:num w:numId="4" w16cid:durableId="864565369">
-    <w:abstractNumId w:val="8"/>
+    <w:abstractNumId w:val="9"/>
   </w:num>
   <w:num w:numId="5" w16cid:durableId="350112403">
-    <w:abstractNumId w:val="9"/>
+    <w:abstractNumId w:val="10"/>
   </w:num>
   <w:num w:numId="6" w16cid:durableId="1786385003">
     <w:abstractNumId w:val="1"/>
   </w:num>
   <w:num w:numId="7" w16cid:durableId="1036200526">
-    <w:abstractNumId w:val="10"/>
+    <w:abstractNumId w:val="11"/>
   </w:num>
   <w:num w:numId="8" w16cid:durableId="1890530902">
     <w:abstractNumId w:val="5"/>
@@ -2936,16 +3321,19 @@
     <w:abstractNumId w:val="2"/>
   </w:num>
   <w:num w:numId="12" w16cid:durableId="1036613041">
-    <w:abstractNumId w:val="12"/>
+    <w:abstractNumId w:val="13"/>
   </w:num>
   <w:num w:numId="13" w16cid:durableId="1261572405">
-    <w:abstractNumId w:val="7"/>
+    <w:abstractNumId w:val="8"/>
   </w:num>
   <w:num w:numId="14" w16cid:durableId="1710837745">
-    <w:abstractNumId w:val="13"/>
+    <w:abstractNumId w:val="14"/>
   </w:num>
   <w:num w:numId="15" w16cid:durableId="1684283673">
-    <w:abstractNumId w:val="14"/>
+    <w:abstractNumId w:val="15"/>
+  </w:num>
+  <w:num w:numId="16" w16cid:durableId="274486889">
+    <w:abstractNumId w:val="6"/>
   </w:num>
 </w:numbering>
 </file>
@@ -3552,6 +3940,7 @@
   <w:style w:type="character" w:default="1" w:styleId="a0">
     <w:name w:val="Default Paragraph Font"/>
     <w:uiPriority w:val="1"/>
+    <w:semiHidden/>
     <w:unhideWhenUsed/>
   </w:style>
   <w:style w:type="table" w:default="1" w:styleId="a1">

</xml_diff>

<commit_message>
some local changes of writing CV
</commit_message>
<xml_diff>
--- a/作业记录.docx
+++ b/作业记录.docx
@@ -27,6 +27,9 @@
           <w:ilvl w:val="0"/>
           <w:numId w:val="1"/>
         </w:numPr>
+        <w:rPr>
+          <w:rFonts w:hint="eastAsia"/>
+        </w:rPr>
       </w:pPr>
       <w:r>
         <w:rPr>
@@ -271,6 +274,7 @@
     <w:p>
       <w:pPr>
         <w:rPr>
+          <w:rFonts w:hint="eastAsia"/>
           <w:b/>
           <w:bCs/>
         </w:rPr>
@@ -284,7 +288,13 @@
         <w:t>BPE Trainer:</w:t>
       </w:r>
     </w:p>
-    <w:p/>
+    <w:p>
+      <w:pPr>
+        <w:rPr>
+          <w:rFonts w:hint="eastAsia"/>
+        </w:rPr>
+      </w:pPr>
+    </w:p>
     <w:p>
       <w:pPr>
         <w:pStyle w:val="a9"/>
@@ -292,6 +302,9 @@
           <w:ilvl w:val="0"/>
           <w:numId w:val="16"/>
         </w:numPr>
+        <w:rPr>
+          <w:rFonts w:hint="eastAsia"/>
+        </w:rPr>
       </w:pPr>
       <w:r>
         <w:rPr>
@@ -321,6 +334,7 @@
     <w:p>
       <w:pPr>
         <w:rPr>
+          <w:rFonts w:hint="eastAsia"/>
           <w:b/>
           <w:bCs/>
         </w:rPr>
@@ -831,6 +845,230 @@
       <w:pPr>
         <w:rPr>
           <w:rFonts w:hint="eastAsia"/>
+          <w:b/>
+          <w:bCs/>
+        </w:rPr>
+      </w:pPr>
+      <w:r>
+        <w:rPr>
+          <w:rFonts w:hint="eastAsia"/>
+          <w:b/>
+          <w:bCs/>
+        </w:rPr>
+        <w:t>训练稳定性监控</w:t>
+      </w:r>
+    </w:p>
+    <w:p>
+      <w:pPr>
+        <w:pStyle w:val="a9"/>
+        <w:numPr>
+          <w:ilvl w:val="0"/>
+          <w:numId w:val="17"/>
+        </w:numPr>
+        <w:rPr>
+          <w:rFonts w:hint="eastAsia"/>
+        </w:rPr>
+      </w:pPr>
+      <w:r>
+        <w:rPr>
+          <w:rFonts w:hint="eastAsia"/>
+        </w:rPr>
+        <w:t>Per-layer grad norm</w:t>
+      </w:r>
+    </w:p>
+    <w:p>
+      <w:pPr>
+        <w:pStyle w:val="a9"/>
+        <w:numPr>
+          <w:ilvl w:val="0"/>
+          <w:numId w:val="16"/>
+        </w:numPr>
+        <w:rPr>
+          <w:rFonts w:hint="eastAsia"/>
+        </w:rPr>
+      </w:pPr>
+      <w:r>
+        <w:rPr>
+          <w:rFonts w:hint="eastAsia"/>
+        </w:rPr>
+        <w:t>Embedding layer</w:t>
+      </w:r>
+    </w:p>
+    <w:p>
+      <w:pPr>
+        <w:pStyle w:val="a9"/>
+        <w:numPr>
+          <w:ilvl w:val="0"/>
+          <w:numId w:val="16"/>
+        </w:numPr>
+        <w:rPr>
+          <w:rFonts w:hint="eastAsia"/>
+        </w:rPr>
+      </w:pPr>
+      <w:r>
+        <w:rPr>
+          <w:rFonts w:hint="eastAsia"/>
+        </w:rPr>
+        <w:t>Transformer blocks</w:t>
+      </w:r>
+    </w:p>
+    <w:p>
+      <w:pPr>
+        <w:pStyle w:val="a9"/>
+        <w:numPr>
+          <w:ilvl w:val="0"/>
+          <w:numId w:val="16"/>
+        </w:numPr>
+        <w:rPr>
+          <w:rFonts w:hint="eastAsia"/>
+        </w:rPr>
+      </w:pPr>
+      <w:r>
+        <w:rPr>
+          <w:rFonts w:hint="eastAsia"/>
+        </w:rPr>
+        <w:t>Output layer (</w:t>
+      </w:r>
+      <w:proofErr w:type="spellStart"/>
+      <w:r>
+        <w:rPr>
+          <w:rFonts w:hint="eastAsia"/>
+        </w:rPr>
+        <w:t>final_norm</w:t>
+      </w:r>
+      <w:proofErr w:type="spellEnd"/>
+      <w:r>
+        <w:rPr>
+          <w:rFonts w:hint="eastAsia"/>
+        </w:rPr>
+        <w:t xml:space="preserve">, </w:t>
+      </w:r>
+      <w:proofErr w:type="spellStart"/>
+      <w:r>
+        <w:rPr>
+          <w:rFonts w:hint="eastAsia"/>
+        </w:rPr>
+        <w:t>out_linear</w:t>
+      </w:r>
+      <w:proofErr w:type="spellEnd"/>
+      <w:r>
+        <w:rPr>
+          <w:rFonts w:hint="eastAsia"/>
+        </w:rPr>
+        <w:t>)</w:t>
+      </w:r>
+    </w:p>
+    <w:p>
+      <w:pPr>
+        <w:pStyle w:val="a9"/>
+        <w:numPr>
+          <w:ilvl w:val="0"/>
+          <w:numId w:val="17"/>
+        </w:numPr>
+        <w:rPr>
+          <w:rFonts w:hint="eastAsia"/>
+        </w:rPr>
+      </w:pPr>
+      <w:r>
+        <w:rPr>
+          <w:rFonts w:hint="eastAsia"/>
+        </w:rPr>
+        <w:t>Global grad norm</w:t>
+      </w:r>
+    </w:p>
+    <w:p>
+      <w:pPr>
+        <w:widowControl/>
+        <w:jc w:val="left"/>
+        <w:rPr>
+          <w:rFonts w:hint="eastAsia"/>
+        </w:rPr>
+      </w:pPr>
+    </w:p>
+    <w:p>
+      <w:pPr>
+        <w:rPr>
+          <w:rFonts w:hint="eastAsia"/>
+          <w:b/>
+          <w:bCs/>
+          <w:lang w:val="fr-FR"/>
+        </w:rPr>
+      </w:pPr>
+      <w:r>
+        <w:rPr>
+          <w:rFonts w:hint="eastAsia"/>
+          <w:b/>
+          <w:bCs/>
+          <w:lang w:val="fr-FR"/>
+        </w:rPr>
+        <w:t>参数：</w:t>
+      </w:r>
+    </w:p>
+    <w:p>
+      <w:pPr>
+        <w:pStyle w:val="a9"/>
+        <w:numPr>
+          <w:ilvl w:val="0"/>
+          <w:numId w:val="11"/>
+        </w:numPr>
+        <w:rPr>
+          <w:rFonts w:hint="eastAsia"/>
+        </w:rPr>
+      </w:pPr>
+      <w:proofErr w:type="spellStart"/>
+      <w:r>
+        <w:rPr>
+          <w:rFonts w:hint="eastAsia"/>
+        </w:rPr>
+        <w:t>Dataloader</w:t>
+      </w:r>
+      <w:proofErr w:type="spellEnd"/>
+      <w:r>
+        <w:rPr>
+          <w:rFonts w:hint="eastAsia"/>
+        </w:rPr>
+        <w:t>：</w:t>
+      </w:r>
+      <w:proofErr w:type="spellStart"/>
+      <w:r>
+        <w:rPr>
+          <w:rFonts w:hint="eastAsia"/>
+        </w:rPr>
+        <w:t>drop_last</w:t>
+      </w:r>
+      <w:proofErr w:type="spellEnd"/>
+      <w:r>
+        <w:rPr>
+          <w:rFonts w:hint="eastAsia"/>
+        </w:rPr>
+        <w:t xml:space="preserve"> = Tr</w:t>
+      </w:r>
+      <w:r>
+        <w:rPr>
+          <w:rFonts w:hint="eastAsia"/>
+        </w:rPr>
+        <w:t>ue</w:t>
+      </w:r>
+    </w:p>
+    <w:p>
+      <w:pPr>
+        <w:widowControl/>
+        <w:jc w:val="left"/>
+        <w:rPr>
+          <w:rFonts w:hint="eastAsia"/>
+        </w:rPr>
+      </w:pPr>
+      <w:r>
+        <w:rPr>
+          <w:rFonts w:hint="eastAsia"/>
+        </w:rPr>
+        <w:br w:type="page"/>
+      </w:r>
+    </w:p>
+    <w:p>
+      <w:pPr>
+        <w:rPr>
+          <w:rFonts w:hint="eastAsia"/>
         </w:rPr>
       </w:pPr>
     </w:p>
@@ -1135,7 +1373,6 @@
           <w:rFonts w:hint="eastAsia"/>
           <w:lang w:val="fr-FR"/>
         </w:rPr>
-        <w:lastRenderedPageBreak/>
         <w:t>设置模块：model, data</w:t>
       </w:r>
     </w:p>
@@ -1176,6 +1413,7 @@
         <w:ind w:left="360"/>
         <w:rPr>
           <w:rFonts w:hint="eastAsia"/>
+          <w:lang w:val="fr-FR"/>
         </w:rPr>
       </w:pPr>
       <w:r>
@@ -1234,33 +1472,6 @@
           <w:lang w:val="fr-FR"/>
         </w:rPr>
         <w:t>。</w:t>
-      </w:r>
-    </w:p>
-    <w:p>
-      <w:pPr>
-        <w:rPr>
-          <w:rFonts w:hint="eastAsia"/>
-          <w:lang w:val="fr-FR"/>
-        </w:rPr>
-      </w:pPr>
-    </w:p>
-    <w:p>
-      <w:pPr>
-        <w:rPr>
-          <w:rFonts w:hint="eastAsia"/>
-          <w:b/>
-          <w:bCs/>
-          <w:lang w:val="fr-FR"/>
-        </w:rPr>
-      </w:pPr>
-      <w:r>
-        <w:rPr>
-          <w:rFonts w:hint="eastAsia"/>
-          <w:b/>
-          <w:bCs/>
-          <w:lang w:val="fr-FR"/>
-        </w:rPr>
-        <w:t>参数：</w:t>
       </w:r>
     </w:p>
     <w:p>
@@ -1268,46 +1479,41 @@
         <w:pStyle w:val="a9"/>
         <w:numPr>
           <w:ilvl w:val="0"/>
-          <w:numId w:val="11"/>
+          <w:numId w:val="9"/>
         </w:numPr>
         <w:rPr>
           <w:rFonts w:hint="eastAsia"/>
         </w:rPr>
       </w:pPr>
-      <w:proofErr w:type="spellStart"/>
-      <w:r>
-        <w:rPr>
-          <w:rFonts w:hint="eastAsia"/>
-        </w:rPr>
-        <w:t>Dataloader</w:t>
-      </w:r>
-      <w:proofErr w:type="spellEnd"/>
-      <w:r>
-        <w:rPr>
-          <w:rFonts w:hint="eastAsia"/>
-        </w:rPr>
-        <w:t>：</w:t>
-      </w:r>
-      <w:proofErr w:type="spellStart"/>
-      <w:r>
-        <w:rPr>
-          <w:rFonts w:hint="eastAsia"/>
-        </w:rPr>
-        <w:t>drop_last</w:t>
-      </w:r>
-      <w:proofErr w:type="spellEnd"/>
-      <w:r>
-        <w:rPr>
-          <w:rFonts w:hint="eastAsia"/>
-        </w:rPr>
-        <w:t xml:space="preserve"> = Tr</w:t>
-      </w:r>
-      <w:r>
-        <w:rPr>
-          <w:rFonts w:hint="eastAsia"/>
-        </w:rPr>
-        <w:t>ue</w:t>
-      </w:r>
+      <w:r>
+        <w:rPr>
+          <w:rFonts w:hint="eastAsia"/>
+        </w:rPr>
+        <w:t>设置实验代码</w:t>
+      </w:r>
+    </w:p>
+    <w:p>
+      <w:pPr>
+        <w:pStyle w:val="a9"/>
+        <w:ind w:left="360"/>
+        <w:rPr>
+          <w:rFonts w:hint="eastAsia"/>
+        </w:rPr>
+      </w:pPr>
+      <w:r>
+        <w:rPr>
+          <w:rFonts w:hint="eastAsia"/>
+        </w:rPr>
+        <w:t>完成主体代码后，确定实验设置。再根据实验设置重新更新代码：写config文件，将config加入代码等。</w:t>
+      </w:r>
+    </w:p>
+    <w:p>
+      <w:pPr>
+        <w:rPr>
+          <w:rFonts w:hint="eastAsia"/>
+          <w:lang w:val="fr-FR"/>
+        </w:rPr>
+      </w:pPr>
     </w:p>
     <w:p>
       <w:pPr>
@@ -1479,29 +1685,12 @@
           <w:ilvl w:val="0"/>
           <w:numId w:val="15"/>
         </w:numPr>
-        <w:rPr>
-          <w:rFonts w:hint="eastAsia"/>
-          <w:b/>
-          <w:bCs/>
-        </w:rPr>
-      </w:pPr>
-      <w:proofErr w:type="spellStart"/>
-      <w:r>
-        <w:rPr>
-          <w:rFonts w:hint="eastAsia"/>
-          <w:b/>
-          <w:bCs/>
-        </w:rPr>
-        <w:t>Silu</w:t>
-      </w:r>
-      <w:proofErr w:type="spellEnd"/>
-      <w:r>
-        <w:rPr>
-          <w:rFonts w:hint="eastAsia"/>
-          <w:b/>
-          <w:bCs/>
-        </w:rPr>
-        <w:t>测试</w:t>
+      </w:pPr>
+      <w:r>
+        <w:rPr>
+          <w:rFonts w:hint="eastAsia"/>
+        </w:rPr>
+        <w:t>加入perplexity metric （可用于调试context length参数）</w:t>
       </w:r>
     </w:p>
     <w:p>
@@ -1572,10 +1761,20 @@
           <w:ilvl w:val="0"/>
           <w:numId w:val="14"/>
         </w:numPr>
-        <w:rPr>
-          <w:rFonts w:hint="eastAsia"/>
-        </w:rPr>
-      </w:pPr>
+      </w:pPr>
+      <w:r>
+        <w:rPr>
+          <w:rFonts w:hint="eastAsia"/>
+          <w:color w:val="00B050"/>
+        </w:rPr>
+        <w:t>(done)</w:t>
+      </w:r>
+      <w:r>
+        <w:rPr>
+          <w:rFonts w:hint="eastAsia"/>
+        </w:rPr>
+        <w:t xml:space="preserve"> </w:t>
+      </w:r>
       <w:r>
         <w:t>Monitor the norms of activations, model weights, and gradients to make sure they are not exploding or vanishing.</w:t>
       </w:r>
@@ -1603,15 +1802,7 @@
         </w:rPr>
       </w:pPr>
       <w:r>
-        <w:t xml:space="preserve">Train on the </w:t>
-      </w:r>
-      <w:proofErr w:type="spellStart"/>
-      <w:r>
-        <w:t>openWeb</w:t>
-      </w:r>
-      <w:proofErr w:type="spellEnd"/>
-      <w:r>
-        <w:t xml:space="preserve"> dataset</w:t>
+        <w:t>Make some new modification on the model architecture, in order to reduce validation loss</w:t>
       </w:r>
     </w:p>
     <w:p>
@@ -1626,7 +1817,15 @@
         </w:rPr>
       </w:pPr>
       <w:r>
-        <w:t>Make some new modification on the model architecture, in order to reduce validation loss</w:t>
+        <w:t xml:space="preserve">Train on the </w:t>
+      </w:r>
+      <w:proofErr w:type="spellStart"/>
+      <w:r>
+        <w:t>openWeb</w:t>
+      </w:r>
+      <w:proofErr w:type="spellEnd"/>
+      <w:r>
+        <w:t xml:space="preserve"> dataset</w:t>
       </w:r>
     </w:p>
     <w:sectPr>
@@ -2773,6 +2972,95 @@
     </w:lvl>
   </w:abstractNum>
   <w:abstractNum w:abstractNumId="11" w15:restartNumberingAfterBreak="0">
+    <w:nsid w:val="5C3067ED"/>
+    <w:multiLevelType w:val="hybridMultilevel"/>
+    <w:tmpl w:val="C3F62D0A"/>
+    <w:lvl w:ilvl="0" w:tplc="7ABC04BA">
+      <w:start w:val="1"/>
+      <w:numFmt w:val="decimal"/>
+      <w:lvlText w:val="%1）"/>
+      <w:lvlJc w:val="left"/>
+      <w:pPr>
+        <w:ind w:left="360" w:hanging="360"/>
+      </w:pPr>
+      <w:rPr>
+        <w:rFonts w:hint="default"/>
+      </w:rPr>
+    </w:lvl>
+    <w:lvl w:ilvl="1" w:tplc="04090019" w:tentative="1">
+      <w:start w:val="1"/>
+      <w:numFmt w:val="lowerLetter"/>
+      <w:lvlText w:val="%2)"/>
+      <w:lvlJc w:val="left"/>
+      <w:pPr>
+        <w:ind w:left="880" w:hanging="440"/>
+      </w:pPr>
+    </w:lvl>
+    <w:lvl w:ilvl="2" w:tplc="0409001B" w:tentative="1">
+      <w:start w:val="1"/>
+      <w:numFmt w:val="lowerRoman"/>
+      <w:lvlText w:val="%3."/>
+      <w:lvlJc w:val="right"/>
+      <w:pPr>
+        <w:ind w:left="1320" w:hanging="440"/>
+      </w:pPr>
+    </w:lvl>
+    <w:lvl w:ilvl="3" w:tplc="0409000F" w:tentative="1">
+      <w:start w:val="1"/>
+      <w:numFmt w:val="decimal"/>
+      <w:lvlText w:val="%4."/>
+      <w:lvlJc w:val="left"/>
+      <w:pPr>
+        <w:ind w:left="1760" w:hanging="440"/>
+      </w:pPr>
+    </w:lvl>
+    <w:lvl w:ilvl="4" w:tplc="04090019" w:tentative="1">
+      <w:start w:val="1"/>
+      <w:numFmt w:val="lowerLetter"/>
+      <w:lvlText w:val="%5)"/>
+      <w:lvlJc w:val="left"/>
+      <w:pPr>
+        <w:ind w:left="2200" w:hanging="440"/>
+      </w:pPr>
+    </w:lvl>
+    <w:lvl w:ilvl="5" w:tplc="0409001B" w:tentative="1">
+      <w:start w:val="1"/>
+      <w:numFmt w:val="lowerRoman"/>
+      <w:lvlText w:val="%6."/>
+      <w:lvlJc w:val="right"/>
+      <w:pPr>
+        <w:ind w:left="2640" w:hanging="440"/>
+      </w:pPr>
+    </w:lvl>
+    <w:lvl w:ilvl="6" w:tplc="0409000F" w:tentative="1">
+      <w:start w:val="1"/>
+      <w:numFmt w:val="decimal"/>
+      <w:lvlText w:val="%7."/>
+      <w:lvlJc w:val="left"/>
+      <w:pPr>
+        <w:ind w:left="3080" w:hanging="440"/>
+      </w:pPr>
+    </w:lvl>
+    <w:lvl w:ilvl="7" w:tplc="04090019" w:tentative="1">
+      <w:start w:val="1"/>
+      <w:numFmt w:val="lowerLetter"/>
+      <w:lvlText w:val="%8)"/>
+      <w:lvlJc w:val="left"/>
+      <w:pPr>
+        <w:ind w:left="3520" w:hanging="440"/>
+      </w:pPr>
+    </w:lvl>
+    <w:lvl w:ilvl="8" w:tplc="0409001B" w:tentative="1">
+      <w:start w:val="1"/>
+      <w:numFmt w:val="lowerRoman"/>
+      <w:lvlText w:val="%9."/>
+      <w:lvlJc w:val="right"/>
+      <w:pPr>
+        <w:ind w:left="3960" w:hanging="440"/>
+      </w:pPr>
+    </w:lvl>
+  </w:abstractNum>
+  <w:abstractNum w:abstractNumId="12" w15:restartNumberingAfterBreak="0">
     <w:nsid w:val="62B172BF"/>
     <w:multiLevelType w:val="hybridMultilevel"/>
     <w:tmpl w:val="1D66575A"/>
@@ -2885,7 +3173,7 @@
       </w:rPr>
     </w:lvl>
   </w:abstractNum>
-  <w:abstractNum w:abstractNumId="12" w15:restartNumberingAfterBreak="0">
+  <w:abstractNum w:abstractNumId="13" w15:restartNumberingAfterBreak="0">
     <w:nsid w:val="643F0A79"/>
     <w:multiLevelType w:val="hybridMultilevel"/>
     <w:tmpl w:val="07BE7228"/>
@@ -2974,7 +3262,7 @@
       </w:pPr>
     </w:lvl>
   </w:abstractNum>
-  <w:abstractNum w:abstractNumId="13" w15:restartNumberingAfterBreak="0">
+  <w:abstractNum w:abstractNumId="14" w15:restartNumberingAfterBreak="0">
     <w:nsid w:val="69536321"/>
     <w:multiLevelType w:val="hybridMultilevel"/>
     <w:tmpl w:val="6128D462"/>
@@ -3063,7 +3351,7 @@
       </w:pPr>
     </w:lvl>
   </w:abstractNum>
-  <w:abstractNum w:abstractNumId="14" w15:restartNumberingAfterBreak="0">
+  <w:abstractNum w:abstractNumId="15" w15:restartNumberingAfterBreak="0">
     <w:nsid w:val="7B5B1660"/>
     <w:multiLevelType w:val="hybridMultilevel"/>
     <w:tmpl w:val="4C98E968"/>
@@ -3175,7 +3463,7 @@
       </w:rPr>
     </w:lvl>
   </w:abstractNum>
-  <w:abstractNum w:abstractNumId="15" w15:restartNumberingAfterBreak="0">
+  <w:abstractNum w:abstractNumId="16" w15:restartNumberingAfterBreak="0">
     <w:nsid w:val="7DBB36BB"/>
     <w:multiLevelType w:val="hybridMultilevel"/>
     <w:tmpl w:val="01C4007C"/>
@@ -3291,7 +3579,7 @@
     <w:abstractNumId w:val="0"/>
   </w:num>
   <w:num w:numId="2" w16cid:durableId="1578438118">
-    <w:abstractNumId w:val="12"/>
+    <w:abstractNumId w:val="13"/>
   </w:num>
   <w:num w:numId="3" w16cid:durableId="867763447">
     <w:abstractNumId w:val="7"/>
@@ -3306,7 +3594,7 @@
     <w:abstractNumId w:val="1"/>
   </w:num>
   <w:num w:numId="7" w16cid:durableId="1036200526">
-    <w:abstractNumId w:val="11"/>
+    <w:abstractNumId w:val="12"/>
   </w:num>
   <w:num w:numId="8" w16cid:durableId="1890530902">
     <w:abstractNumId w:val="5"/>
@@ -3321,19 +3609,22 @@
     <w:abstractNumId w:val="2"/>
   </w:num>
   <w:num w:numId="12" w16cid:durableId="1036613041">
-    <w:abstractNumId w:val="13"/>
+    <w:abstractNumId w:val="14"/>
   </w:num>
   <w:num w:numId="13" w16cid:durableId="1261572405">
     <w:abstractNumId w:val="8"/>
   </w:num>
   <w:num w:numId="14" w16cid:durableId="1710837745">
-    <w:abstractNumId w:val="14"/>
+    <w:abstractNumId w:val="15"/>
   </w:num>
   <w:num w:numId="15" w16cid:durableId="1684283673">
-    <w:abstractNumId w:val="15"/>
+    <w:abstractNumId w:val="16"/>
   </w:num>
   <w:num w:numId="16" w16cid:durableId="274486889">
     <w:abstractNumId w:val="6"/>
+  </w:num>
+  <w:num w:numId="17" w16cid:durableId="98915631">
+    <w:abstractNumId w:val="11"/>
   </w:num>
 </w:numbering>
 </file>

</xml_diff>

<commit_message>
add flops computing funcs and d_768_c_512 config
</commit_message>
<xml_diff>
--- a/作业记录.docx
+++ b/作业记录.docx
@@ -177,7 +177,21 @@
         <w:rPr>
           <w:rFonts w:hint="eastAsia"/>
         </w:rPr>
-        <w:t>，计算了不同模块的FLOPs占比，以及占比随model size的变化</w:t>
+        <w:t>，计算了不同模块的FLOPs占比，以及</w:t>
+      </w:r>
+      <w:proofErr w:type="gramStart"/>
+      <w:r>
+        <w:rPr>
+          <w:rFonts w:hint="eastAsia"/>
+        </w:rPr>
+        <w:t>占比随</w:t>
+      </w:r>
+      <w:proofErr w:type="gramEnd"/>
+      <w:r>
+        <w:rPr>
+          <w:rFonts w:hint="eastAsia"/>
+        </w:rPr>
+        <w:t>model size的变化</w:t>
       </w:r>
     </w:p>
     <w:p>
@@ -523,15 +537,13 @@
         </w:numPr>
         <w:rPr>
           <w:rFonts w:hint="eastAsia"/>
-          <w:color w:val="00B0F0"/>
-        </w:rPr>
-      </w:pPr>
-      <w:r>
-        <w:rPr>
-          <w:rFonts w:hint="eastAsia"/>
-          <w:color w:val="00B0F0"/>
-        </w:rPr>
-        <w:t>Grads clipping (to be done)</w:t>
+        </w:rPr>
+      </w:pPr>
+      <w:r>
+        <w:rPr>
+          <w:rFonts w:hint="eastAsia"/>
+        </w:rPr>
+        <w:t>Grads clipping</w:t>
       </w:r>
     </w:p>
     <w:p>
@@ -582,6 +594,9 @@
         </w:rPr>
       </w:pPr>
       <w:r>
+        <w:rPr>
+          <w:color w:val="00B0F0"/>
+        </w:rPr>
         <w:t>Distributed training</w:t>
       </w:r>
     </w:p>
@@ -1627,7 +1642,23 @@
           <w:rFonts w:hint="eastAsia"/>
           <w:lang w:val="fr-FR"/>
         </w:rPr>
-        <w:t>测试：改为使用torch的dataloader，再只在validation set上跑一遍看时长</w:t>
+        <w:t>测试：改为使用torch的dataloader，</w:t>
+      </w:r>
+      <w:proofErr w:type="gramStart"/>
+      <w:r>
+        <w:rPr>
+          <w:rFonts w:hint="eastAsia"/>
+          <w:lang w:val="fr-FR"/>
+        </w:rPr>
+        <w:t>再只在</w:t>
+      </w:r>
+      <w:proofErr w:type="gramEnd"/>
+      <w:r>
+        <w:rPr>
+          <w:rFonts w:hint="eastAsia"/>
+          <w:lang w:val="fr-FR"/>
+        </w:rPr>
+        <w:t>validation set上跑一遍看时长</w:t>
       </w:r>
     </w:p>
     <w:p>
@@ -1685,6 +1716,9 @@
           <w:ilvl w:val="0"/>
           <w:numId w:val="15"/>
         </w:numPr>
+        <w:rPr>
+          <w:rFonts w:hint="eastAsia"/>
+        </w:rPr>
       </w:pPr>
       <w:r>
         <w:rPr>
@@ -1761,6 +1795,9 @@
           <w:ilvl w:val="0"/>
           <w:numId w:val="14"/>
         </w:numPr>
+        <w:rPr>
+          <w:rFonts w:hint="eastAsia"/>
+        </w:rPr>
       </w:pPr>
       <w:r>
         <w:rPr>
@@ -1776,7 +1813,15 @@
         <w:t xml:space="preserve"> </w:t>
       </w:r>
       <w:r>
-        <w:t>Monitor the norms of activations, model weights, and gradients to make sure they are not exploding or vanishing.</w:t>
+        <w:t xml:space="preserve">Monitor the norms of </w:t>
+      </w:r>
+      <w:proofErr w:type="gramStart"/>
+      <w:r>
+        <w:t>activations</w:t>
+      </w:r>
+      <w:proofErr w:type="gramEnd"/>
+      <w:r>
+        <w:t>, model weights, and gradients to make sure they are not exploding or vanishing.</w:t>
       </w:r>
       <w:r>
         <w:t xml:space="preserve"> Do this on some model modifications, like remove </w:t>
@@ -1802,7 +1847,23 @@
         </w:rPr>
       </w:pPr>
       <w:r>
-        <w:t>Make some new modification on the model architecture, in order to reduce validation loss</w:t>
+        <w:t xml:space="preserve">Make some new </w:t>
+      </w:r>
+      <w:proofErr w:type="gramStart"/>
+      <w:r>
+        <w:t>modification</w:t>
+      </w:r>
+      <w:proofErr w:type="gramEnd"/>
+      <w:r>
+        <w:t xml:space="preserve"> on the model architecture, </w:t>
+      </w:r>
+      <w:proofErr w:type="gramStart"/>
+      <w:r>
+        <w:t>in order to</w:t>
+      </w:r>
+      <w:proofErr w:type="gramEnd"/>
+      <w:r>
+        <w:t xml:space="preserve"> reduce validation loss</w:t>
       </w:r>
     </w:p>
     <w:p>

</xml_diff>